<commit_message>
Auto commit (2026-10-28 15:02) — 3 changes
Claude Code 세션 종료 시 자동 커밋.

Co-Authored-By: Claude <noreply@anthropic.com>
</commit_message>
<xml_diff>
--- a/projects/35_dragon_lord_s2/One Night with the Dragon Lord - The Dragon Eggs_작가 피드백(1023 · 1-8화)_10.28.docx
+++ b/projects/35_dragon_lord_s2/One Night with the Dragon Lord - The Dragon Eggs_작가 피드백(1023 · 1-8화)_10.28.docx
@@ -415,7 +415,7 @@
           <w:color w:val="1A1A1A"/>
           <w:sz w:val="21"/>
         </w:rPr>
-        <w:t>: 8화는 시청자가 9화를 보게 만들어야 하는 마지막 무료 화인데, 부화 다음에 에드릭과 귀족들이 무릎이 부러져 엎드리는 결과까지 다 보여 주고 끝나요. 그리고 "이졸데를 밟던 사람들이 엎드린다"는 바엘이 거대한 검은 용으로 왕도에 내려앉을 때 터뜨릴 장면이라, 8화에서 아기 용들이 먼저 쓰면 그때 힘이 빠져요.</w:t>
+        <w:t>: 8화는 시청자가 9화를 보게 만들어야 하는 마지막 무료 화인데, 부화 다음에 에드릭과 귀족들이 무릎이 부러져 엎드리는 결과까지 다 보여 주고 끝나요. 그리고 "이졸데를 밟던 사람들이 엎드린다"는 바엘이 거대한 검은 용으로 왕도에 내려앉을 때 보여 줄 장면이에요. 8화에서 아기 용들 때문에 먼저 나오면, 바엘이 내려앉는 날 시청자는 같은 장면을 두 번째로 보게 돼서 덜 세져요.</w:t>
       </w:r>
     </w:p>
     <w:p>
@@ -712,7 +712,7 @@
           <w:color w:val="1A1A1A"/>
           <w:sz w:val="21"/>
         </w:rPr>
-        <w:t>: 바엘이 늦는 이유를 다리가 아니라 반란군으로 바꿔 주세요. 2-3에서 토렌이 막을 때 「维尔（怒吼）：滚开！谁敢拦我，死！」와 출발 지문 대신 바엘이 성에 남는 쪽을 고르고(「维尔（咬牙）：天亮之前，杀光叛军。」 날이 밝기 전에 반란군을 다 죽인다.), 5-3·7-3은 손바닥 문양이 뜰 때마다 반란군을 더 거칠게 베어 나가는 장면으로 바꾸면 바엘이 나올 때마다 한 칸씩 이졸데에게 가까워져요. 다리를 살리고 싶으시면, 5-3에서 바엘이 날아서 넘으려다 보랏빛 불길에 날개가 타서 떨어지는 그림으로 "날아서도 못 넘는다"를 보여 주고, 7-3은 그 불길에 금이 가는 결과까지 보여 주세요.</w:t>
+        <w:t>: 바엘이 늦는 이유를 다리가 아니라 반란군으로 바꿔 주세요. 2-3에서 토렌이 막을 때 「维尔（怒吼）：滚开！谁敢拦我，死！」와 출발 지문 대신 바엘이 성에 남는 쪽을 고르고(「维尔（咬牙）：天亮之前，杀光叛军。」 날이 밝기 전에 반란군을 다 죽인다.), 5-3·7-3은 손바닥 문양이 뜰 때마다 반란군을 더 거칠게 베어 나가는 장면으로 바꾸면 바엘이 나올 때마다 한 칸씩 이졸데에게 가까워져요. 다리를 살리고 싶으시면, 5-3에서 바엘이 날아서 넘으려다 보랏빛 불길에 날개가 타서 떨어지는 그림으로 "날아서도 못 넘는다"를 보여 주고, 7-3은 바엘의 주먹에 그 보랏빛 불길이 갈라지는 결과까지 보여 주세요.</w:t>
       </w:r>
     </w:p>
     <w:p>
@@ -1754,7 +1754,7 @@
           <w:color w:val="1A1A1A"/>
           <w:sz w:val="21"/>
         </w:rPr>
-        <w:t>: 첫 줄을 빼면 속마음 다음 「△埃德里克站起身，一步步走下台阶，停在伊索尔德面前。」로 바로 이어지고, 둘째 줄을 이렇게 줄여 주세요. 「埃德里克（嗤笑）：龙族抓人类女人只当祭品，从来不娶。你是被龙玩腻了扔回来的，戒指是偷的。」(용족은 인간 여자를 잡아가 제물로 쓸 뿐 아내로 안 맞아. 넌 용이 갖고 놀다 버린 여자고, 반지는 훔친 거야.)</w:t>
+        <w:t>: 첫 줄을 빼면 그 앞 에드릭 속마음 줄(「埃德里克（OS）：不，我不能承认她就是公主和龙后。」로 시작하는 줄) 다음에 「△埃德里克站起身，一步步走下台阶，停在伊索尔德面前。」로 바로 이어지고, 둘째 줄을 이렇게 줄여 주세요. 「埃德里克（嗤笑）：龙族抓人类女人只当祭品，从来不娶。你是被龙玩腻了扔回来的，戒指是偷的。」(용족은 인간 여자를 잡아가 제물로 쓸 뿐 아내로 안 맞아. 넌 용이 갖고 놀다 버린 여자고, 반지는 훔친 거야.)</w:t>
       </w:r>
     </w:p>
     <w:p>
@@ -3511,7 +3511,7 @@
           <w:color w:val="1A1A1A"/>
           <w:sz w:val="21"/>
         </w:rPr>
-        <w:t>: 2-2 대사 줄의 「边境士兵1/2」는 1-2에서 이졸데가 당하는 걸 구경하다 눈에 진흙을 맞은 병사들과 이름표가 같아요. 같은 사람이면 이졸데를 바로 알아봐야 하고, 다른 사람이면 같은 얼굴로 만들어져요. 2-2 안에서도 인물 줄은 「巡逻士兵」, 대사·지문은 「边境士兵」「士兵」으로 섞여 있어요. 그리고 알을 빼앗은 건 병사 2인데 알을 들고 떠나는 건 병사 1이에요.</w:t>
+        <w:t>: 2-2 대사 줄의 「边境士兵1/2」는 1-2에서 이졸데가 당하는 걸 구경하다 눈에 진흙을 맞은 병사들과 이름표가 같아요. 같은 사람이면 이졸데를 바로 알아봐야 해요. 다른 사람이면, 이름표가 같아서 영상을 만들 때 1-2 병사와 같은 얼굴로 나올 수 있어요. 2-2 안에서도 인물 줄은 「巡逻士兵」, 대사·지문은 「边境士兵」「士兵」으로 섞여 있어요. 그리고 알을 빼앗은 건 병사 2인데 알을 들고 떠나는 건 병사 1이에요.</w:t>
       </w:r>
     </w:p>
     <w:p>
@@ -3701,7 +3701,7 @@
           <w:color w:val="1A1A1A"/>
           <w:sz w:val="21"/>
         </w:rPr>
-        <w:t>: 1·3화의 무기는 머리에 숨긴 부러진 비녀 반쪽인데, 8화에는 멀쩡한 금비녀가 머리에서 나와요. 다른 물건으로 만들어지고, 감옥에 갇혀 머리채까지 잡혀 끌려다닌 이졸데가 금비녀를 꽂고 있는 것도 어색해요.</w:t>
+        <w:t>: 1·3화의 무기는 머리에 숨긴 부러진 비녀 반쪽인데, 8화에는 멀쩡한 금비녀가 머리에서 나와요. 영상에서 다른 물건으로 나오고, 감옥에 갇혀 머리채까지 잡혀 끌려다닌 이졸데가 금비녀를 꽂고 있는 것도 어색해요.</w:t>
       </w:r>
     </w:p>
     <w:p>
@@ -3863,7 +3863,7 @@
           <w:color w:val="1A1A1A"/>
           <w:sz w:val="21"/>
         </w:rPr>
-        <w:t>: 4-1에선 손에 들고 있는 "검은 바탕에 금 무늬, 용이 감긴 반지"인데, 바로 이어지는 5-1에선 "약지에 낀 검은 보석 반지"예요. 생김새가 달라 다른 반지로 만들어지고, 언제 손가락에 꼈는지도 없어요.</w:t>
+        <w:t>: 4-1에선 손에 들고 있는 "검은 바탕에 금 무늬, 용이 감긴 반지"인데, 바로 이어지는 5-1에선 "약지에 낀 검은 보석 반지"예요. 생김새가 달라 영상에서 다른 반지로 나오고, 언제 손가락에 꼈는지도 없어요.</w:t>
       </w:r>
     </w:p>
     <w:p>
@@ -4243,7 +4243,7 @@
           <w:color w:val="1A1A1A"/>
           <w:sz w:val="21"/>
         </w:rPr>
-        <w:t>: 그은 곳은 손바닥인데 철창에 대는 건 손목이라, 상처 위치가 두 군데로 만들어져요. 어느 손인지도 5-4에서야 나와요.</w:t>
+        <w:t>: 그은 곳은 손바닥인데 철창에 대는 건 손목이라, 영상에서 상처가 두 군데로 나와요. 어느 손인지도 5-4에서야 나와요.</w:t>
       </w:r>
     </w:p>
     <w:p>
@@ -4869,7 +4869,7 @@
           <w:color w:val="1A1A1A"/>
           <w:sz w:val="21"/>
         </w:rPr>
-        <w:t>: 3-3·4-1·5-1은 같은 대전, 5-2와 5-4는 이졸데가 철창에 피를 흘리던 같은 자리(사이에 5-3 바엘 장면만 끼어 있어요), 5-3과 7-3은 같은 절벽인데 장면 머리 이름이 다 달라서 다른 장소로 만들어져요. 5-2는 머리가 「密道」인데 장면은 복도에서 바닥을 닦다가 철창까지 걸어가요.</w:t>
+        <w:t>: 3-3·4-1·5-1은 같은 대전, 5-2와 5-4는 이졸데가 철창에 피를 흘리던 같은 자리(사이에 5-3 바엘 장면만 끼어 있어요), 5-3과 7-3은 같은 절벽인데 장면 머리 이름이 다 달라서 영상에서 다른 장소로 나올 수 있어요. 5-2는 머리가 「密道」인데 장면은 복도에서 바닥을 닦다가 철창까지 걸어가요.</w:t>
       </w:r>
     </w:p>
     <w:p>
@@ -5270,7 +5270,7 @@
           <w:color w:val="1A1A1A"/>
           <w:sz w:val="21"/>
         </w:rPr>
-        <w:t>· 5-3 「发出一声低沉的怒吼」</w:t>
+        <w:t>· 5-3 「发出一声低沉吼」을 「发出一声低沉的怒吼」로 (「低沉」 뒤에 글자가 빠졌어요)</w:t>
       </w:r>
     </w:p>
     <w:p>

</xml_diff>

<commit_message>
Auto commit (2026-10-28 15:30) — 7 changes
Claude Code 세션 종료 시 자동 커밋.

Co-Authored-By: Claude <noreply@anthropic.com>
</commit_message>
<xml_diff>
--- a/projects/35_dragon_lord_s2/One Night with the Dragon Lord - The Dragon Eggs_작가 피드백(1023 · 1-8화)_10.28.docx
+++ b/projects/35_dragon_lord_s2/One Night with the Dragon Lord - The Dragon Eggs_작가 피드백(1023 · 1-8화)_10.28.docx
@@ -56,7 +56,7 @@
           <w:color w:val="1A1A1A"/>
           <w:sz w:val="21"/>
         </w:rPr>
-        <w:t>· 판정: 크게 고칠 곳은 두 군데예요. ① 8화 끝이 부화 다음에 흑룡 두 마리·에드릭과 귀족 무릎 골절·전원 엎드림까지 가서, 바엘이 검은 용으로 내려앉을 때 터뜨릴 "밟던 자들이 엎드린다"를 아기 용들이 미리 쓰고 결과까지 다 보여 주고 끝나요. ② 바엘이 2화에 이미 알고 출발했는데 5·7화에 같은 절벽에서 같은 동작(문양 보고 화내고 친다)만 해서, 날 수 있는 용이 다리 하나에 6화째 막혀 있는 그림이에요.</w:t>
+        <w:t>· 판정: 크게 고칠 곳은 두 군데예요. ① 8화 끝이 부화 · 흑룡 두 마리 강림 · 에드릭과 귀족 전원 무릎 골절·엎드림까지 다 보여 주고 끝나서, 이졸데가 이긴 결과가 무료 마지막 화에 이미 나와요(흑룡이 바엘이면 남편 도착까지). ② 바엘이 2화에 이미 알고 출발했는데 5·7화에 같은 절벽에서 같은 동작(문양 보고 화내고 친다)만 해서, 날 수 있는 용이 다리 하나에 6화째 막혀 있는 그림이에요.</w:t>
       </w:r>
     </w:p>
     <w:p>
@@ -415,7 +415,7 @@
           <w:color w:val="1A1A1A"/>
           <w:sz w:val="21"/>
         </w:rPr>
-        <w:t>: 8화는 시청자가 9화를 보게 만들어야 하는 마지막 무료 화인데, 부화 다음에 에드릭과 귀족들이 무릎이 부러져 엎드리는 결과까지 다 보여 주고 끝나요. 그리고 "이졸데를 밟던 사람들이 엎드린다"는 바엘이 거대한 검은 용으로 왕도에 내려앉을 때 보여 줄 장면이에요. 8화에서 아기 용들 때문에 먼저 나오면, 바엘이 내려앉는 날 시청자는 같은 장면을 두 번째로 보게 돼서 덜 세져요.</w:t>
+        <w:t>: 8화는 무료 마지막 화인데, 알이 깨어나고, 흑룡 두 마리가 내려오고, 에드릭과 귀족들이 모두 무릎이 부러져 엎드리는 데까지 한 화에 다 나와요. 이졸데가 이긴 결과가 이미 화면에 나와서, 9화에 무슨 일이 생길지 궁금한 게 남지 않아요. 흑룡 두 마리가 누구인지도 안 적혀 있어요. 7화에 바엘이 하늘로 주먹을 날리고 감옥 위에서 굉음이 난 다음이라 시청자는 바엘이 온 걸로 볼 텐데, 그렇다면 남편이 오는 장면까지 8화에서 다 나온 거예요.</w:t>
       </w:r>
     </w:p>
     <w:p>

</xml_diff>

<commit_message>
Auto commit (2026-10-28 15:43) — 11 changes
Claude Code 세션 종료 시 자동 커밋.

Co-Authored-By: Claude <noreply@anthropic.com>
Claude-Session: https://claude.ai/code/52d1c2c9-8188-4640-b61c-a7aee210702f
</commit_message>
<xml_diff>
--- a/projects/35_dragon_lord_s2/One Night with the Dragon Lord - The Dragon Eggs_작가 피드백(1023 · 1-8화)_10.28.docx
+++ b/projects/35_dragon_lord_s2/One Night with the Dragon Lord - The Dragon Eggs_작가 피드백(1023 · 1-8화)_10.28.docx
@@ -56,7 +56,7 @@
           <w:color w:val="1A1A1A"/>
           <w:sz w:val="21"/>
         </w:rPr>
-        <w:t>· 판정: 크게 고칠 곳은 두 군데예요. ① 8화 끝이 부화 · 흑룡 두 마리 강림 · 에드릭과 귀족 전원 무릎 골절·엎드림까지 다 보여 주고 끝나서, 이졸데가 이긴 결과가 무료 마지막 화에 이미 나와요(흑룡이 바엘이면 남편 도착까지). ② 바엘이 2화에 이미 알고 출발했는데 5·7화에 같은 절벽에서 같은 동작(문양 보고 화내고 친다)만 해서, 날 수 있는 용이 다리 하나에 6화째 막혀 있는 그림이에요.</w:t>
+        <w:t>· 판정: 크게 고칠 곳은 두 군데예요. ① 8화 끝 흑룡 두 마리가 누구인지 대본에 없어요(3장 블록). 8화 끝 자체를 줄이자는 앞선 의견은 철회 — 에드릭은 살아 있고 왕좌·신분도 그대로라 복수가 끝난 게 아니고, "흑룡이 누구냐"가 9화로 넘어가는 궁금증으로 남아요. ② 바엘이 2화에 이미 알고 출발했는데 5·7화에 같은 절벽에서 같은 동작(문양 보고 화내고 친다)만 해서, 날 수 있는 용이 다리 하나에 6화째 막혀 있는 그림이에요.</w:t>
       </w:r>
     </w:p>
     <w:p>
@@ -234,224 +234,6 @@
           <w:color w:val="1A1A1A"/>
           <w:sz w:val="22"/>
         </w:rPr>
-        <w:t>[8화 · 8-1] 마지막 무료 화가 에드릭과 귀족이 엎드리는 데까지 다 보여 주고 끝나요</w:t>
-      </w:r>
-    </w:p>
-    <w:p>
-      <w:pPr>
-        <w:spacing w:before="0" w:after="100" w:line="312" w:lineRule="auto"/>
-      </w:pPr>
-      <w:r>
-        <w:rPr>
-          <w:rFonts w:ascii="맑은 고딕" w:hAnsi="맑은 고딕" w:eastAsia="맑은 고딕"/>
-          <w:b/>
-          <w:color w:val="1A1A1A"/>
-          <w:sz w:val="21"/>
-        </w:rPr>
-        <w:t>원문</w:t>
-      </w:r>
-      <w:r>
-        <w:rPr>
-          <w:rFonts w:ascii="맑은 고딕" w:hAnsi="맑은 고딕" w:eastAsia="맑은 고딕"/>
-          <w:b w:val="0"/>
-          <w:color w:val="1A1A1A"/>
-          <w:sz w:val="21"/>
-        </w:rPr>
-        <w:t>:</w:t>
-      </w:r>
-    </w:p>
-    <w:p>
-      <w:pPr>
-        <w:spacing w:before="0" w:after="100" w:line="312" w:lineRule="auto"/>
-      </w:pPr>
-      <w:r>
-        <w:rPr>
-          <w:rFonts w:ascii="맑은 고딕" w:hAnsi="맑은 고딕" w:eastAsia="맑은 고딕"/>
-          <w:b w:val="0"/>
-          <w:color w:val="1A1A1A"/>
-          <w:sz w:val="21"/>
-        </w:rPr>
-        <w:t>(8-1) △幼龙发出震耳欲聋的咆哮。同一秒，整个王国的天空乌云密布。</w:t>
-      </w:r>
-    </w:p>
-    <w:p>
-      <w:pPr>
-        <w:spacing w:before="0" w:after="100" w:line="312" w:lineRule="auto"/>
-      </w:pPr>
-      <w:r>
-        <w:rPr>
-          <w:rFonts w:ascii="맑은 고딕" w:hAnsi="맑은 고딕" w:eastAsia="맑은 고딕"/>
-          <w:b w:val="0"/>
-          <w:color w:val="1A1A1A"/>
-          <w:sz w:val="21"/>
-        </w:rPr>
-        <w:t>(8-1) △两条纯血黑龙，轰然降临在广场上空！</w:t>
-      </w:r>
-    </w:p>
-    <w:p>
-      <w:pPr>
-        <w:spacing w:before="0" w:after="100" w:line="312" w:lineRule="auto"/>
-      </w:pPr>
-      <w:r>
-        <w:rPr>
-          <w:rFonts w:ascii="맑은 고딕" w:hAnsi="맑은 고딕" w:eastAsia="맑은 고딕"/>
-          <w:b w:val="0"/>
-          <w:color w:val="1A1A1A"/>
-          <w:sz w:val="21"/>
-        </w:rPr>
-        <w:t>(8-1) △广场上的所有贵族和埃德里克，双腿膝盖同时骨折，所有人齐刷刷地惨叫着跪伏在地。</w:t>
-      </w:r>
-    </w:p>
-    <w:p>
-      <w:pPr>
-        <w:spacing w:before="0" w:after="100" w:line="312" w:lineRule="auto"/>
-      </w:pPr>
-      <w:r>
-        <w:rPr>
-          <w:rFonts w:ascii="맑은 고딕" w:hAnsi="맑은 고딕" w:eastAsia="맑은 고딕"/>
-          <w:b w:val="0"/>
-          <w:color w:val="1A1A1A"/>
-          <w:sz w:val="21"/>
-        </w:rPr>
-        <w:t>(8-1) △狂风呼啸，黑火在广场四周燃烧。</w:t>
-      </w:r>
-    </w:p>
-    <w:p>
-      <w:pPr>
-        <w:spacing w:before="0" w:after="100" w:line="312" w:lineRule="auto"/>
-      </w:pPr>
-      <w:r>
-        <w:rPr>
-          <w:rFonts w:ascii="맑은 고딕" w:hAnsi="맑은 고딕" w:eastAsia="맑은 고딕"/>
-          <w:b/>
-          <w:color w:val="1A1A1A"/>
-          <w:sz w:val="21"/>
-        </w:rPr>
-        <w:t>번역</w:t>
-      </w:r>
-      <w:r>
-        <w:rPr>
-          <w:rFonts w:ascii="맑은 고딕" w:hAnsi="맑은 고딕" w:eastAsia="맑은 고딕"/>
-          <w:b w:val="0"/>
-          <w:color w:val="1A1A1A"/>
-          <w:sz w:val="21"/>
-        </w:rPr>
-        <w:t>:</w:t>
-      </w:r>
-    </w:p>
-    <w:p>
-      <w:pPr>
-        <w:spacing w:before="0" w:after="100" w:line="312" w:lineRule="auto"/>
-      </w:pPr>
-      <w:r>
-        <w:rPr>
-          <w:rFonts w:ascii="맑은 고딕" w:hAnsi="맑은 고딕" w:eastAsia="맑은 고딕"/>
-          <w:b w:val="0"/>
-          <w:color w:val="1A1A1A"/>
-          <w:sz w:val="21"/>
-        </w:rPr>
-        <w:t>아기 용들이 귀청이 찢어질 듯 포효한다. 같은 순간 왕국 하늘 전체에 먹구름이 몰려든다.</w:t>
-      </w:r>
-    </w:p>
-    <w:p>
-      <w:pPr>
-        <w:spacing w:before="0" w:after="100" w:line="312" w:lineRule="auto"/>
-      </w:pPr>
-      <w:r>
-        <w:rPr>
-          <w:rFonts w:ascii="맑은 고딕" w:hAnsi="맑은 고딕" w:eastAsia="맑은 고딕"/>
-          <w:b w:val="0"/>
-          <w:color w:val="1A1A1A"/>
-          <w:sz w:val="21"/>
-        </w:rPr>
-        <w:t>순혈 흑룡 두 마리가 굉음과 함께 광장 상공에 내려온다!</w:t>
-      </w:r>
-    </w:p>
-    <w:p>
-      <w:pPr>
-        <w:spacing w:before="0" w:after="100" w:line="312" w:lineRule="auto"/>
-      </w:pPr>
-      <w:r>
-        <w:rPr>
-          <w:rFonts w:ascii="맑은 고딕" w:hAnsi="맑은 고딕" w:eastAsia="맑은 고딕"/>
-          <w:b w:val="0"/>
-          <w:color w:val="1A1A1A"/>
-          <w:sz w:val="21"/>
-        </w:rPr>
-        <w:t>광장의 귀족들과 에드릭 모두 두 무릎이 한꺼번에 부러지고, 다 같이 비명을 지르며 엎드린다.</w:t>
-      </w:r>
-    </w:p>
-    <w:p>
-      <w:pPr>
-        <w:spacing w:before="0" w:after="100" w:line="312" w:lineRule="auto"/>
-      </w:pPr>
-      <w:r>
-        <w:rPr>
-          <w:rFonts w:ascii="맑은 고딕" w:hAnsi="맑은 고딕" w:eastAsia="맑은 고딕"/>
-          <w:b w:val="0"/>
-          <w:color w:val="1A1A1A"/>
-          <w:sz w:val="21"/>
-        </w:rPr>
-        <w:t>거센 바람이 불고 광장 사방에 검은 불길이 탄다.</w:t>
-      </w:r>
-    </w:p>
-    <w:p>
-      <w:pPr>
-        <w:spacing w:before="0" w:after="100" w:line="312" w:lineRule="auto"/>
-      </w:pPr>
-      <w:r>
-        <w:rPr>
-          <w:rFonts w:ascii="맑은 고딕" w:hAnsi="맑은 고딕" w:eastAsia="맑은 고딕"/>
-          <w:b/>
-          <w:color w:val="1A1A1A"/>
-          <w:sz w:val="21"/>
-        </w:rPr>
-        <w:t>문제</w:t>
-      </w:r>
-      <w:r>
-        <w:rPr>
-          <w:rFonts w:ascii="맑은 고딕" w:hAnsi="맑은 고딕" w:eastAsia="맑은 고딕"/>
-          <w:b w:val="0"/>
-          <w:color w:val="1A1A1A"/>
-          <w:sz w:val="21"/>
-        </w:rPr>
-        <w:t>: 8화는 무료 마지막 화인데, 알이 깨어나고, 흑룡 두 마리가 내려오고, 에드릭과 귀족들이 모두 무릎이 부러져 엎드리는 데까지 한 화에 다 나와요. 이졸데가 이긴 결과가 이미 화면에 나와서, 9화에 무슨 일이 생길지 궁금한 게 남지 않아요. 흑룡 두 마리가 누구인지도 안 적혀 있어요. 7화에 바엘이 하늘로 주먹을 날리고 감옥 위에서 굉음이 난 다음이라 시청자는 바엘이 온 걸로 볼 텐데, 그렇다면 남편이 오는 장면까지 8화에서 다 나온 거예요.</w:t>
-      </w:r>
-    </w:p>
-    <w:p>
-      <w:pPr>
-        <w:spacing w:before="0" w:after="100" w:line="312" w:lineRule="auto"/>
-      </w:pPr>
-      <w:r>
-        <w:rPr>
-          <w:rFonts w:ascii="맑은 고딕" w:hAnsi="맑은 고딕" w:eastAsia="맑은 고딕"/>
-          <w:b/>
-          <w:color w:val="1A1A1A"/>
-          <w:sz w:val="21"/>
-        </w:rPr>
-        <w:t>제안</w:t>
-      </w:r>
-      <w:r>
-        <w:rPr>
-          <w:rFonts w:ascii="맑은 고딕" w:hAnsi="맑은 고딕" w:eastAsia="맑은 고딕"/>
-          <w:b w:val="0"/>
-          <w:color w:val="1A1A1A"/>
-          <w:sz w:val="21"/>
-        </w:rPr>
-        <w:t>: 위 네 줄을 빼고, 마지막 줄 「△伊索尔德擦掉嘴角的血，两只凶悍的幼龙一左一右，死死护在她身前，对着地上的埃德里克发出低吼。」를 아기 용이 불을 뿜기 직전에서 끊는 줄로 바꿔 주세요. 「△两只幼龙一左一右护在伊索尔德身前。其中一只张开嘴，对准地上的埃德里克，喉咙里的黑火越烧越亮。」(아기 용 두 마리가 이졸데 앞을 좌우로 막아선다. 한 마리가 입을 벌려 바닥의 에드릭을 겨누고, 목구멍 속 검은 불이 점점 밝아진다.) 에드릭이 타는지, 귀족들이 어떻게 되는지는 9화 첫 장면으로 넘겨 주세요.</w:t>
-      </w:r>
-    </w:p>
-    <w:p>
-      <w:pPr>
-        <w:spacing w:before="200" w:after="60" w:line="312" w:lineRule="auto"/>
-      </w:pPr>
-      <w:r>
-        <w:rPr>
-          <w:rFonts w:ascii="맑은 고딕" w:hAnsi="맑은 고딕" w:eastAsia="맑은 고딕"/>
-          <w:b/>
-          <w:color w:val="1A1A1A"/>
-          <w:sz w:val="22"/>
-        </w:rPr>
         <w:t>[2·5·7화 · 2-3 / 5-3 / 7-3] 바엘이 2화에 떠났는데 5화·7화에 같은 절벽에서 같은 동작만 해요</w:t>
       </w:r>
     </w:p>
@@ -2676,7 +2458,7 @@
           <w:color w:val="1A1A1A"/>
           <w:sz w:val="22"/>
         </w:rPr>
-        <w:t>[3·4화 · 4·5화 · 6·7화 사이] 장면이 그대로 이어지는데 인물 줄에서 사람이 빠지거나 생겨요</w:t>
+        <w:t>[4화 · 4-1] 알이 이졸데 품에서 근위병 손으로 넘어가는 순간이 없어요</w:t>
       </w:r>
     </w:p>
     <w:p>
@@ -2713,7 +2495,7 @@
           <w:color w:val="1A1A1A"/>
           <w:sz w:val="21"/>
         </w:rPr>
-        <w:t>(3-3 인물 줄) 出场人物：伊索尔德、王宫卫兵、埃德里克</w:t>
+        <w:t>(4-1) △两名卫兵应声上前，就要抢夺伊索尔德怀中的龙蛋，同时拖拽她离开大殿。</w:t>
       </w:r>
     </w:p>
     <w:p>
@@ -2727,7 +2509,7 @@
           <w:color w:val="1A1A1A"/>
           <w:sz w:val="21"/>
         </w:rPr>
-        <w:t>(4-1) △恢弘空旷的大殿，高窗投下束束日光。两列贵族分立大殿两侧，交头接耳，目光全都落在跪倒在地的伊索尔德身上。</w:t>
+        <w:t>(4-1) △卫兵闻声停下动作，退向两旁。</w:t>
       </w:r>
     </w:p>
     <w:p>
@@ -2741,7 +2523,7 @@
           <w:color w:val="1A1A1A"/>
           <w:sz w:val="21"/>
         </w:rPr>
-        <w:t>(4-1 인물 줄) 出场人物：伊索尔德、埃德里克、赫尔加、众贵族、王宫卫兵</w:t>
+        <w:t>(4-1) △卫兵抱着龙蛋朝着大殿外宝库方向远去。</w:t>
       </w:r>
     </w:p>
     <w:p>
@@ -2751,11 +2533,20 @@
       <w:r>
         <w:rPr>
           <w:rFonts w:ascii="맑은 고딕" w:hAnsi="맑은 고딕" w:eastAsia="맑은 고딕"/>
+          <w:b/>
+          <w:color w:val="1A1A1A"/>
+          <w:sz w:val="21"/>
+        </w:rPr>
+        <w:t>번역</w:t>
+      </w:r>
+      <w:r>
+        <w:rPr>
+          <w:rFonts w:ascii="맑은 고딕" w:hAnsi="맑은 고딕" w:eastAsia="맑은 고딕"/>
           <w:b w:val="0"/>
           <w:color w:val="1A1A1A"/>
           <w:sz w:val="21"/>
         </w:rPr>
-        <w:t>(5-1 인물 줄) 出场人物：伊索尔德、埃德里克、卫兵</w:t>
+        <w:t>:</w:t>
       </w:r>
     </w:p>
     <w:p>
@@ -2769,7 +2560,7 @@
           <w:color w:val="1A1A1A"/>
           <w:sz w:val="21"/>
         </w:rPr>
-        <w:t>(6-1) △全场的哄笑声瞬间死寂。贵族们倒吸一口凉气。</w:t>
+        <w:t>근위병 두 명이 명령을 받고 다가와 이졸데 품의 알을 빼앗으려 하며 그녀를 대전 밖으로 끌어내려 한다.</w:t>
       </w:r>
     </w:p>
     <w:p>
@@ -2783,7 +2574,7 @@
           <w:color w:val="1A1A1A"/>
           <w:sz w:val="21"/>
         </w:rPr>
-        <w:t>(7-1 인물 줄) 出场人物：伊索尔德、埃德里克、卫兵</w:t>
+        <w:t>근위병들이 그 말에 동작을 멈추고 양옆으로 물러난다.</w:t>
       </w:r>
     </w:p>
     <w:p>
@@ -2793,20 +2584,11 @@
       <w:r>
         <w:rPr>
           <w:rFonts w:ascii="맑은 고딕" w:hAnsi="맑은 고딕" w:eastAsia="맑은 고딕"/>
-          <w:b/>
-          <w:color w:val="1A1A1A"/>
-          <w:sz w:val="21"/>
-        </w:rPr>
-        <w:t>번역</w:t>
-      </w:r>
-      <w:r>
-        <w:rPr>
-          <w:rFonts w:ascii="맑은 고딕" w:hAnsi="맑은 고딕" w:eastAsia="맑은 고딕"/>
           <w:b w:val="0"/>
           <w:color w:val="1A1A1A"/>
           <w:sz w:val="21"/>
         </w:rPr>
-        <w:t>:</w:t>
+        <w:t>근위병이 알을 안고 대전 밖 보물고 쪽으로 멀어진다.</w:t>
       </w:r>
     </w:p>
     <w:p>
@@ -2816,11 +2598,20 @@
       <w:r>
         <w:rPr>
           <w:rFonts w:ascii="맑은 고딕" w:hAnsi="맑은 고딕" w:eastAsia="맑은 고딕"/>
+          <w:b/>
+          <w:color w:val="1A1A1A"/>
+          <w:sz w:val="21"/>
+        </w:rPr>
+        <w:t>문제</w:t>
+      </w:r>
+      <w:r>
+        <w:rPr>
+          <w:rFonts w:ascii="맑은 고딕" w:hAnsi="맑은 고딕" w:eastAsia="맑은 고딕"/>
           <w:b w:val="0"/>
           <w:color w:val="1A1A1A"/>
           <w:sz w:val="21"/>
         </w:rPr>
-        <w:t>3-3 등장인물: 이졸데, 왕궁 근위병, 에드릭</w:t>
+        <w:t>: 근위병들은 알을 빼앗기 직전에 헬가 말에 멈추고 물러났는데, 몇 줄 뒤 근위병이 알을 안고 나가요. 이졸데는 두 팔로 알을 감싸고 있었는데 언제 빼앗겼는지가 화면에 없어요. 아이를 빼앗기는 순간이라 이졸데 감정에도 중요한 자리예요.</w:t>
       </w:r>
     </w:p>
     <w:p>
@@ -2830,25 +2621,34 @@
       <w:r>
         <w:rPr>
           <w:rFonts w:ascii="맑은 고딕" w:hAnsi="맑은 고딕" w:eastAsia="맑은 고딕"/>
+          <w:b/>
+          <w:color w:val="1A1A1A"/>
+          <w:sz w:val="21"/>
+        </w:rPr>
+        <w:t>제안</w:t>
+      </w:r>
+      <w:r>
+        <w:rPr>
+          <w:rFonts w:ascii="맑은 고딕" w:hAnsi="맑은 고딕" w:eastAsia="맑은 고딕"/>
           <w:b w:val="0"/>
           <w:color w:val="1A1A1A"/>
           <w:sz w:val="21"/>
         </w:rPr>
-        <w:t>웅장하고 넓은 대전, 높은 창으로 햇살이 쏟아진다. 귀족들이 대전 양쪽에 두 줄로 서서 수군거리며 무릎 꿇은 이졸데를 본다.</w:t>
+        <w:t>: 헬가에게 뺨을 맞는 줄에 붙여 주세요. 「△伊索尔德被打得偏过头，唇角再度渗出血丝，不可置信。卫兵趁机从她怀里夺走龙蛋。」(뺨을 맞고 고개가 돌아간 틈에 근위병이 이졸데 품에서 알을 빼앗는다.)</w:t>
       </w:r>
     </w:p>
     <w:p>
       <w:pPr>
-        <w:spacing w:before="0" w:after="100" w:line="312" w:lineRule="auto"/>
-      </w:pPr>
-      <w:r>
-        <w:rPr>
-          <w:rFonts w:ascii="맑은 고딕" w:hAnsi="맑은 고딕" w:eastAsia="맑은 고딕"/>
-          <w:b w:val="0"/>
-          <w:color w:val="1A1A1A"/>
-          <w:sz w:val="21"/>
-        </w:rPr>
-        <w:t>4-1 등장인물: 이졸데, 에드릭, 헬가, 귀족들, 왕궁 근위병</w:t>
+        <w:spacing w:before="200" w:after="60" w:line="312" w:lineRule="auto"/>
+      </w:pPr>
+      <w:r>
+        <w:rPr>
+          <w:rFonts w:ascii="맑은 고딕" w:hAnsi="맑은 고딕" w:eastAsia="맑은 고딕"/>
+          <w:b/>
+          <w:color w:val="1A1A1A"/>
+          <w:sz w:val="22"/>
+        </w:rPr>
+        <w:t>[7화 · 7-1 / 7-2] 이졸데가 알을 안은 채 끌려 나가요</w:t>
       </w:r>
     </w:p>
     <w:p>
@@ -2858,11 +2658,20 @@
       <w:r>
         <w:rPr>
           <w:rFonts w:ascii="맑은 고딕" w:hAnsi="맑은 고딕" w:eastAsia="맑은 고딕"/>
+          <w:b/>
+          <w:color w:val="1A1A1A"/>
+          <w:sz w:val="21"/>
+        </w:rPr>
+        <w:t>원문</w:t>
+      </w:r>
+      <w:r>
+        <w:rPr>
+          <w:rFonts w:ascii="맑은 고딕" w:hAnsi="맑은 고딕" w:eastAsia="맑은 고딕"/>
           <w:b w:val="0"/>
           <w:color w:val="1A1A1A"/>
           <w:sz w:val="21"/>
         </w:rPr>
-        <w:t>5-1 등장인물: 이졸데, 에드릭, 근위병</w:t>
+        <w:t>:</w:t>
       </w:r>
     </w:p>
     <w:p>
@@ -2876,7 +2685,7 @@
           <w:color w:val="1A1A1A"/>
           <w:sz w:val="21"/>
         </w:rPr>
-        <w:t>장내의 웃음소리가 뚝 끊긴다. 귀족들이 숨을 들이켠다.</w:t>
+        <w:t>(7-1) △伊索尔德痛得浑身颤抖，额头直冒冷汗，双手依旧死死抱着龙蛋。</w:t>
       </w:r>
     </w:p>
     <w:p>
@@ -2890,7 +2699,7 @@
           <w:color w:val="1A1A1A"/>
           <w:sz w:val="21"/>
         </w:rPr>
-        <w:t>7-1 등장인물: 이졸데, 에드릭, 근위병</w:t>
+        <w:t>(7-1) △埃德里克猛地拔出重剑扔在地上。他一把揪住伊索尔德的长发，不顾她肩上的伤将她强行往外拖。</w:t>
       </w:r>
     </w:p>
     <w:p>
@@ -2904,7 +2713,7 @@
           <w:color w:val="1A1A1A"/>
           <w:sz w:val="21"/>
         </w:rPr>
-        <w:t>문제</w:t>
+        <w:t>번역</w:t>
       </w:r>
       <w:r>
         <w:rPr>
@@ -2913,7 +2722,7 @@
           <w:color w:val="1A1A1A"/>
           <w:sz w:val="21"/>
         </w:rPr>
-        <w:t>: 5-1과 7-1은 앞 화 마지막 순간에서 바로 이어지는 같은 자리예요. 4-1 끝에 헬가는 이졸데 바로 앞에 서 있고 귀족들이 대전 양쪽에 있는데 5-1 인물 줄엔 둘 다 없고, 6-1 귀족들도 7-1 인물 줄에 없어요. 인물 줄대로 만들면 화가 바뀌는 순간 사람들이 사라져요. 3-3과 4-1 사이는 반대로, 3-3 인물 줄에 없는 귀족 두 줄이 4-1 첫 장면부터 서 있어요.</w:t>
+        <w:t>:</w:t>
       </w:r>
     </w:p>
     <w:p>
@@ -2923,34 +2732,25 @@
       <w:r>
         <w:rPr>
           <w:rFonts w:ascii="맑은 고딕" w:hAnsi="맑은 고딕" w:eastAsia="맑은 고딕"/>
-          <w:b/>
-          <w:color w:val="1A1A1A"/>
-          <w:sz w:val="21"/>
-        </w:rPr>
-        <w:t>제안</w:t>
-      </w:r>
-      <w:r>
-        <w:rPr>
-          <w:rFonts w:ascii="맑은 고딕" w:hAnsi="맑은 고딕" w:eastAsia="맑은 고딕"/>
           <w:b w:val="0"/>
           <w:color w:val="1A1A1A"/>
           <w:sz w:val="21"/>
         </w:rPr>
-        <w:t>: 3-3 인물 줄에 「众贵族」, 5-1에 「赫尔加、众贵族」, 7-1에 「贵族们」을 넣어 주세요.</w:t>
+        <w:t>이졸데가 고통으로 온몸을 떨고 식은땀을 흘리면서도 두 손으로 알을 꼭 끌어안고 있다.</w:t>
       </w:r>
     </w:p>
     <w:p>
       <w:pPr>
-        <w:spacing w:before="200" w:after="60" w:line="312" w:lineRule="auto"/>
-      </w:pPr>
-      <w:r>
-        <w:rPr>
-          <w:rFonts w:ascii="맑은 고딕" w:hAnsi="맑은 고딕" w:eastAsia="맑은 고딕"/>
-          <w:b/>
-          <w:color w:val="1A1A1A"/>
-          <w:sz w:val="22"/>
-        </w:rPr>
-        <w:t>[4화 · 4-1] 알이 이졸데 품에서 근위병 손으로 넘어가는 순간이 없어요</w:t>
+        <w:spacing w:before="0" w:after="100" w:line="312" w:lineRule="auto"/>
+      </w:pPr>
+      <w:r>
+        <w:rPr>
+          <w:rFonts w:ascii="맑은 고딕" w:hAnsi="맑은 고딕" w:eastAsia="맑은 고딕"/>
+          <w:b w:val="0"/>
+          <w:color w:val="1A1A1A"/>
+          <w:sz w:val="21"/>
+        </w:rPr>
+        <w:t>에드릭이 검을 뽑아 바닥에 던진다. 이졸데의 긴 머리채를 잡고 어깨 상처도 아랑곳없이 밖으로 끌고 간다.</w:t>
       </w:r>
     </w:p>
     <w:p>
@@ -2964,7 +2764,7 @@
           <w:color w:val="1A1A1A"/>
           <w:sz w:val="21"/>
         </w:rPr>
-        <w:t>원문</w:t>
+        <w:t>문제</w:t>
       </w:r>
       <w:r>
         <w:rPr>
@@ -2973,7 +2773,7 @@
           <w:color w:val="1A1A1A"/>
           <w:sz w:val="21"/>
         </w:rPr>
-        <w:t>:</w:t>
+        <w:t>: 이졸데는 두 손으로 알을 꼭 안고 있는데, 머리채를 잡혀 끌려 나가는 사이 알을 놓는 줄이 없어요. 7-2 침실에서는 빈손이에요(오른손으로 술잔을 잡아요).</w:t>
       </w:r>
     </w:p>
     <w:p>
@@ -2983,25 +2783,34 @@
       <w:r>
         <w:rPr>
           <w:rFonts w:ascii="맑은 고딕" w:hAnsi="맑은 고딕" w:eastAsia="맑은 고딕"/>
+          <w:b/>
+          <w:color w:val="1A1A1A"/>
+          <w:sz w:val="21"/>
+        </w:rPr>
+        <w:t>제안</w:t>
+      </w:r>
+      <w:r>
+        <w:rPr>
+          <w:rFonts w:ascii="맑은 고딕" w:hAnsi="맑은 고딕" w:eastAsia="맑은 고딕"/>
           <w:b w:val="0"/>
           <w:color w:val="1A1A1A"/>
           <w:sz w:val="21"/>
         </w:rPr>
-        <w:t>(4-1) △两名卫兵应声上前，就要抢夺伊索尔德怀中的龙蛋，同时拖拽她离开大殿。</w:t>
+        <w:t>: 「…不顾她肩上的伤将她强行往外拖。龙蛋从她怀里滚落回托盘。」(… 강제로 끌고 나간다. 알이 이졸데 품에서 쟁반 위로 굴러떨어진다.)</w:t>
       </w:r>
     </w:p>
     <w:p>
       <w:pPr>
-        <w:spacing w:before="0" w:after="100" w:line="312" w:lineRule="auto"/>
-      </w:pPr>
-      <w:r>
-        <w:rPr>
-          <w:rFonts w:ascii="맑은 고딕" w:hAnsi="맑은 고딕" w:eastAsia="맑은 고딕"/>
-          <w:b w:val="0"/>
-          <w:color w:val="1A1A1A"/>
-          <w:sz w:val="21"/>
-        </w:rPr>
-        <w:t>(4-1) △卫兵闻声停下动作，退向两旁。</w:t>
+        <w:spacing w:before="200" w:after="60" w:line="312" w:lineRule="auto"/>
+      </w:pPr>
+      <w:r>
+        <w:rPr>
+          <w:rFonts w:ascii="맑은 고딕" w:hAnsi="맑은 고딕" w:eastAsia="맑은 고딕"/>
+          <w:b/>
+          <w:color w:val="1A1A1A"/>
+          <w:sz w:val="22"/>
+        </w:rPr>
+        <w:t>[2화 · 2-2] 2-2 병사 이름표가 1-2 병사와 같고, 한 장면 안에서도 세 가지로 불려요</w:t>
       </w:r>
     </w:p>
     <w:p>
@@ -3011,11 +2820,20 @@
       <w:r>
         <w:rPr>
           <w:rFonts w:ascii="맑은 고딕" w:hAnsi="맑은 고딕" w:eastAsia="맑은 고딕"/>
+          <w:b/>
+          <w:color w:val="1A1A1A"/>
+          <w:sz w:val="21"/>
+        </w:rPr>
+        <w:t>원문</w:t>
+      </w:r>
+      <w:r>
+        <w:rPr>
+          <w:rFonts w:ascii="맑은 고딕" w:hAnsi="맑은 고딕" w:eastAsia="맑은 고딕"/>
           <w:b w:val="0"/>
           <w:color w:val="1A1A1A"/>
           <w:sz w:val="21"/>
         </w:rPr>
-        <w:t>(4-1) △卫兵抱着龙蛋朝着大殿外宝库方向远去。</w:t>
+        <w:t>:</w:t>
       </w:r>
     </w:p>
     <w:p>
@@ -3025,20 +2843,11 @@
       <w:r>
         <w:rPr>
           <w:rFonts w:ascii="맑은 고딕" w:hAnsi="맑은 고딕" w:eastAsia="맑은 고딕"/>
-          <w:b/>
-          <w:color w:val="1A1A1A"/>
-          <w:sz w:val="21"/>
-        </w:rPr>
-        <w:t>번역</w:t>
-      </w:r>
-      <w:r>
-        <w:rPr>
-          <w:rFonts w:ascii="맑은 고딕" w:hAnsi="맑은 고딕" w:eastAsia="맑은 고딕"/>
           <w:b w:val="0"/>
           <w:color w:val="1A1A1A"/>
           <w:sz w:val="21"/>
         </w:rPr>
-        <w:t>:</w:t>
+        <w:t>(1-2 인물 줄) 出场人物：伊索尔德、恶霸士兵、边境士兵1、边境士兵2</w:t>
       </w:r>
     </w:p>
     <w:p>
@@ -3052,7 +2861,7 @@
           <w:color w:val="1A1A1A"/>
           <w:sz w:val="21"/>
         </w:rPr>
-        <w:t>근위병 두 명이 명령을 받고 다가와 이졸데 품의 알을 빼앗으려 하며 그녀를 대전 밖으로 끌어내려 한다.</w:t>
+        <w:t>(2-2 인물 줄) 出场人物：伊索尔德、小镇居民数名、边境巡逻士兵1、巡逻士兵2</w:t>
       </w:r>
     </w:p>
     <w:p>
@@ -3066,7 +2875,7 @@
           <w:color w:val="1A1A1A"/>
           <w:sz w:val="21"/>
         </w:rPr>
-        <w:t>근위병들이 그 말에 동작을 멈추고 양옆으로 물러난다.</w:t>
+        <w:t>(2-2) 边境士兵1（厉声）：站住！怀里藏的什么东西，交出来！</w:t>
       </w:r>
     </w:p>
     <w:p>
@@ -3080,7 +2889,7 @@
           <w:color w:val="1A1A1A"/>
           <w:sz w:val="21"/>
         </w:rPr>
-        <w:t>근위병이 알을 안고 대전 밖 보물고 쪽으로 멀어진다.</w:t>
+        <w:t>(2-2) △士兵2粗暴地伸手，硬生生从伊索尔德怀里将两颗龙蛋夺走！</w:t>
       </w:r>
     </w:p>
     <w:p>
@@ -3090,20 +2899,11 @@
       <w:r>
         <w:rPr>
           <w:rFonts w:ascii="맑은 고딕" w:hAnsi="맑은 고딕" w:eastAsia="맑은 고딕"/>
-          <w:b/>
-          <w:color w:val="1A1A1A"/>
-          <w:sz w:val="21"/>
-        </w:rPr>
-        <w:t>문제</w:t>
-      </w:r>
-      <w:r>
-        <w:rPr>
-          <w:rFonts w:ascii="맑은 고딕" w:hAnsi="맑은 고딕" w:eastAsia="맑은 고딕"/>
           <w:b w:val="0"/>
           <w:color w:val="1A1A1A"/>
           <w:sz w:val="21"/>
         </w:rPr>
-        <w:t>: 근위병들은 알을 빼앗기 직전에 헬가 말에 멈추고 물러났는데, 몇 줄 뒤 근위병이 알을 안고 나가요. 이졸데는 두 팔로 알을 감싸고 있었는데 언제 빼앗겼는지가 화면에 없어요. 아이를 빼앗기는 순간이라 이졸데 감정에도 중요한 자리예요.</w:t>
+        <w:t>(2-2) △士兵1一把将伊索尔德推倒在地，不理会她的哭喊，带着龙蛋朝着兵营方向离去。</w:t>
       </w:r>
     </w:p>
     <w:p>
@@ -3117,7 +2917,7 @@
           <w:color w:val="1A1A1A"/>
           <w:sz w:val="21"/>
         </w:rPr>
-        <w:t>제안</w:t>
+        <w:t>번역</w:t>
       </w:r>
       <w:r>
         <w:rPr>
@@ -3126,21 +2926,21 @@
           <w:color w:val="1A1A1A"/>
           <w:sz w:val="21"/>
         </w:rPr>
-        <w:t>: 헬가에게 뺨을 맞는 줄에 붙여 주세요. 「△伊索尔德被打得偏过头，唇角再度渗出血丝，不可置信。卫兵趁机从她怀里夺走龙蛋。」(뺨을 맞고 고개가 돌아간 틈에 근위병이 이졸데 품에서 알을 빼앗는다.)</w:t>
+        <w:t>:</w:t>
       </w:r>
     </w:p>
     <w:p>
       <w:pPr>
-        <w:spacing w:before="200" w:after="60" w:line="312" w:lineRule="auto"/>
-      </w:pPr>
-      <w:r>
-        <w:rPr>
-          <w:rFonts w:ascii="맑은 고딕" w:hAnsi="맑은 고딕" w:eastAsia="맑은 고딕"/>
-          <w:b/>
-          <w:color w:val="1A1A1A"/>
-          <w:sz w:val="22"/>
-        </w:rPr>
-        <w:t>[7화 · 7-1 / 7-2] 이졸데가 알을 안은 채 끌려 나가요</w:t>
+        <w:spacing w:before="0" w:after="100" w:line="312" w:lineRule="auto"/>
+      </w:pPr>
+      <w:r>
+        <w:rPr>
+          <w:rFonts w:ascii="맑은 고딕" w:hAnsi="맑은 고딕" w:eastAsia="맑은 고딕"/>
+          <w:b w:val="0"/>
+          <w:color w:val="1A1A1A"/>
+          <w:sz w:val="21"/>
+        </w:rPr>
+        <w:t>1-2 등장인물: 이졸데, 악질 병사, 국경 병사 1, 국경 병사 2</w:t>
       </w:r>
     </w:p>
     <w:p>
@@ -3150,20 +2950,11 @@
       <w:r>
         <w:rPr>
           <w:rFonts w:ascii="맑은 고딕" w:hAnsi="맑은 고딕" w:eastAsia="맑은 고딕"/>
-          <w:b/>
-          <w:color w:val="1A1A1A"/>
-          <w:sz w:val="21"/>
-        </w:rPr>
-        <w:t>원문</w:t>
-      </w:r>
-      <w:r>
-        <w:rPr>
-          <w:rFonts w:ascii="맑은 고딕" w:hAnsi="맑은 고딕" w:eastAsia="맑은 고딕"/>
           <w:b w:val="0"/>
           <w:color w:val="1A1A1A"/>
           <w:sz w:val="21"/>
         </w:rPr>
-        <w:t>:</w:t>
+        <w:t>2-2 등장인물: 이졸데, 마을 주민 여럿, 국경 순찰 병사 1, 순찰 병사 2</w:t>
       </w:r>
     </w:p>
     <w:p>
@@ -3177,7 +2968,7 @@
           <w:color w:val="1A1A1A"/>
           <w:sz w:val="21"/>
         </w:rPr>
-        <w:t>(7-1) △伊索尔德痛得浑身颤抖，额头直冒冷汗，双手依旧死死抱着龙蛋。</w:t>
+        <w:t>국경 병사 1(호통치며): 멈춰! 품에 숨긴 게 뭐야? 내놔!</w:t>
       </w:r>
     </w:p>
     <w:p>
@@ -3191,7 +2982,7 @@
           <w:color w:val="1A1A1A"/>
           <w:sz w:val="21"/>
         </w:rPr>
-        <w:t>(7-1) △埃德里克猛地拔出重剑扔在地上。他一把揪住伊索尔德的长发，不顾她肩上的伤将她强行往外拖。</w:t>
+        <w:t>병사 2가 거칠게 손을 뻗어 이졸데 품에서 알 두 개를 억지로 빼앗는다!</w:t>
       </w:r>
     </w:p>
     <w:p>
@@ -3201,20 +2992,11 @@
       <w:r>
         <w:rPr>
           <w:rFonts w:ascii="맑은 고딕" w:hAnsi="맑은 고딕" w:eastAsia="맑은 고딕"/>
-          <w:b/>
-          <w:color w:val="1A1A1A"/>
-          <w:sz w:val="21"/>
-        </w:rPr>
-        <w:t>번역</w:t>
-      </w:r>
-      <w:r>
-        <w:rPr>
-          <w:rFonts w:ascii="맑은 고딕" w:hAnsi="맑은 고딕" w:eastAsia="맑은 고딕"/>
           <w:b w:val="0"/>
           <w:color w:val="1A1A1A"/>
           <w:sz w:val="21"/>
         </w:rPr>
-        <w:t>:</w:t>
+        <w:t>병사 1이 이졸데를 밀쳐 넘어뜨리고, 울부짖는 소리를 무시한 채 알을 가지고 병영 쪽으로 떠난다.</w:t>
       </w:r>
     </w:p>
     <w:p>
@@ -3224,11 +3006,20 @@
       <w:r>
         <w:rPr>
           <w:rFonts w:ascii="맑은 고딕" w:hAnsi="맑은 고딕" w:eastAsia="맑은 고딕"/>
+          <w:b/>
+          <w:color w:val="1A1A1A"/>
+          <w:sz w:val="21"/>
+        </w:rPr>
+        <w:t>문제</w:t>
+      </w:r>
+      <w:r>
+        <w:rPr>
+          <w:rFonts w:ascii="맑은 고딕" w:hAnsi="맑은 고딕" w:eastAsia="맑은 고딕"/>
           <w:b w:val="0"/>
           <w:color w:val="1A1A1A"/>
           <w:sz w:val="21"/>
         </w:rPr>
-        <w:t>이졸데가 고통으로 온몸을 떨고 식은땀을 흘리면서도 두 손으로 알을 꼭 끌어안고 있다.</w:t>
+        <w:t>: 2-2 대사 줄의 「边境士兵1/2」는 1-2에서 이졸데가 당하는 걸 구경하다 눈에 진흙을 맞은 병사들과 이름표가 같아요. 같은 사람이면 이졸데를 바로 알아봐야 해요. 다른 사람이면, 이름표가 같아서 영상을 만들 때 1-2 병사와 같은 얼굴로 나올 수 있어요. 2-2 안에서도 인물 줄은 「巡逻士兵」, 대사·지문은 「边境士兵」「士兵」으로 섞여 있어요. 그리고 알을 빼앗은 건 병사 2인데 알을 들고 떠나는 건 병사 1이에요.</w:t>
       </w:r>
     </w:p>
     <w:p>
@@ -3238,34 +3029,34 @@
       <w:r>
         <w:rPr>
           <w:rFonts w:ascii="맑은 고딕" w:hAnsi="맑은 고딕" w:eastAsia="맑은 고딕"/>
+          <w:b/>
+          <w:color w:val="1A1A1A"/>
+          <w:sz w:val="21"/>
+        </w:rPr>
+        <w:t>제안</w:t>
+      </w:r>
+      <w:r>
+        <w:rPr>
+          <w:rFonts w:ascii="맑은 고딕" w:hAnsi="맑은 고딕" w:eastAsia="맑은 고딕"/>
           <w:b w:val="0"/>
           <w:color w:val="1A1A1A"/>
           <w:sz w:val="21"/>
         </w:rPr>
-        <w:t>에드릭이 검을 뽑아 바닥에 던진다. 이졸데의 긴 머리채를 잡고 어깨 상처도 아랑곳없이 밖으로 끌고 간다.</w:t>
+        <w:t>: 다른 병사라면 2-2의 대사·지문을 모두 「巡逻士兵1」「巡逻士兵2」로 맞춰 주세요. 떠나는 줄은 「△巡逻士兵1一把将伊索尔德推倒在地，巡逻士兵2抱着龙蛋，两人朝兵营方向离去。」처럼 알을 든 사람을 맞춰 주세요.</w:t>
       </w:r>
     </w:p>
     <w:p>
       <w:pPr>
-        <w:spacing w:before="0" w:after="100" w:line="312" w:lineRule="auto"/>
+        <w:spacing w:before="200" w:after="60" w:line="312" w:lineRule="auto"/>
       </w:pPr>
       <w:r>
         <w:rPr>
           <w:rFonts w:ascii="맑은 고딕" w:hAnsi="맑은 고딕" w:eastAsia="맑은 고딕"/>
           <w:b/>
           <w:color w:val="1A1A1A"/>
-          <w:sz w:val="21"/>
-        </w:rPr>
-        <w:t>문제</w:t>
-      </w:r>
-      <w:r>
-        <w:rPr>
-          <w:rFonts w:ascii="맑은 고딕" w:hAnsi="맑은 고딕" w:eastAsia="맑은 고딕"/>
-          <w:b w:val="0"/>
-          <w:color w:val="1A1A1A"/>
-          <w:sz w:val="21"/>
-        </w:rPr>
-        <w:t>: 이졸데는 두 손으로 알을 꼭 안고 있는데, 머리채를 잡혀 끌려 나가는 사이 알을 놓는 줄이 없어요. 7-2 침실에서는 빈손이에요(오른손으로 술잔을 잡아요).</w:t>
+          <w:sz w:val="22"/>
+        </w:rPr>
+        <w:t>[8화 · 8-1] 1·3화의 "부러진 비녀 반쪽"이 8화에서 "금비녀"로 바뀌어요</w:t>
       </w:r>
     </w:p>
     <w:p>
@@ -3279,7 +3070,7 @@
           <w:color w:val="1A1A1A"/>
           <w:sz w:val="21"/>
         </w:rPr>
-        <w:t>제안</w:t>
+        <w:t>원문</w:t>
       </w:r>
       <w:r>
         <w:rPr>
@@ -3288,21 +3079,21 @@
           <w:color w:val="1A1A1A"/>
           <w:sz w:val="21"/>
         </w:rPr>
-        <w:t>: 「…不顾她肩上的伤将她强行往外拖。龙蛋从她怀里滚落回托盘。」(… 강제로 끌고 나간다. 알이 이졸데 품에서 쟁반 위로 굴러떨어진다.)</w:t>
+        <w:t>:</w:t>
       </w:r>
     </w:p>
     <w:p>
       <w:pPr>
-        <w:spacing w:before="200" w:after="60" w:line="312" w:lineRule="auto"/>
-      </w:pPr>
-      <w:r>
-        <w:rPr>
-          <w:rFonts w:ascii="맑은 고딕" w:hAnsi="맑은 고딕" w:eastAsia="맑은 고딕"/>
-          <w:b/>
-          <w:color w:val="1A1A1A"/>
-          <w:sz w:val="22"/>
-        </w:rPr>
-        <w:t>[2화 · 2-2] 2-2 병사 이름표가 1-2 병사와 같고, 한 장면 안에서도 세 가지로 불려요</w:t>
+        <w:spacing w:before="0" w:after="100" w:line="312" w:lineRule="auto"/>
+      </w:pPr>
+      <w:r>
+        <w:rPr>
+          <w:rFonts w:ascii="맑은 고딕" w:hAnsi="맑은 고딕" w:eastAsia="맑은 고딕"/>
+          <w:b w:val="0"/>
+          <w:color w:val="1A1A1A"/>
+          <w:sz w:val="21"/>
+        </w:rPr>
+        <w:t>(1-2) △挣扎间，伊索尔德摸出藏在发间的半截碎簪，手腕一翻，狠狠扎进按着她的那只手掌。</w:t>
       </w:r>
     </w:p>
     <w:p>
@@ -3312,20 +3103,11 @@
       <w:r>
         <w:rPr>
           <w:rFonts w:ascii="맑은 고딕" w:hAnsi="맑은 고딕" w:eastAsia="맑은 고딕"/>
-          <w:b/>
-          <w:color w:val="1A1A1A"/>
-          <w:sz w:val="21"/>
-        </w:rPr>
-        <w:t>원문</w:t>
-      </w:r>
-      <w:r>
-        <w:rPr>
-          <w:rFonts w:ascii="맑은 고딕" w:hAnsi="맑은 고딕" w:eastAsia="맑은 고딕"/>
           <w:b w:val="0"/>
           <w:color w:val="1A1A1A"/>
           <w:sz w:val="21"/>
         </w:rPr>
-        <w:t>:</w:t>
+        <w:t>(3-1) △伊索尔德借着火光与浓烟的掩护，猛地从侧面扑出，带血的碎簪狠狠扎进抱蛋士兵的肩膀。</w:t>
       </w:r>
     </w:p>
     <w:p>
@@ -3339,7 +3121,7 @@
           <w:color w:val="1A1A1A"/>
           <w:sz w:val="21"/>
         </w:rPr>
-        <w:t>(1-2 인물 줄) 出场人物：伊索尔德、恶霸士兵、边境士兵1、边境士兵2</w:t>
+        <w:t>(8-1) △伊索尔德原本哀求的眼神骤然变得狠戾，右手猛地从头发上取下一支金簪。</w:t>
       </w:r>
     </w:p>
     <w:p>
@@ -3349,11 +3131,20 @@
       <w:r>
         <w:rPr>
           <w:rFonts w:ascii="맑은 고딕" w:hAnsi="맑은 고딕" w:eastAsia="맑은 고딕"/>
+          <w:b/>
+          <w:color w:val="1A1A1A"/>
+          <w:sz w:val="21"/>
+        </w:rPr>
+        <w:t>번역</w:t>
+      </w:r>
+      <w:r>
+        <w:rPr>
+          <w:rFonts w:ascii="맑은 고딕" w:hAnsi="맑은 고딕" w:eastAsia="맑은 고딕"/>
           <w:b w:val="0"/>
           <w:color w:val="1A1A1A"/>
           <w:sz w:val="21"/>
         </w:rPr>
-        <w:t>(2-2 인물 줄) 出场人物：伊索尔德、小镇居民数名、边境巡逻士兵1、巡逻士兵2</w:t>
+        <w:t>:</w:t>
       </w:r>
     </w:p>
     <w:p>
@@ -3367,7 +3158,7 @@
           <w:color w:val="1A1A1A"/>
           <w:sz w:val="21"/>
         </w:rPr>
-        <w:t>(2-2) 边境士兵1（厉声）：站住！怀里藏的什么东西，交出来！</w:t>
+        <w:t>몸부림치던 이졸데가 머리카락 사이에 숨긴 부러진 비녀 반쪽을 꺼내, 손목을 틀어 자기를 누르는 손바닥에 꽂는다.</w:t>
       </w:r>
     </w:p>
     <w:p>
@@ -3381,7 +3172,7 @@
           <w:color w:val="1A1A1A"/>
           <w:sz w:val="21"/>
         </w:rPr>
-        <w:t>(2-2) △士兵2粗暴地伸手，硬生生从伊索尔德怀里将两颗龙蛋夺走！</w:t>
+        <w:t>이졸데가 불빛과 연기를 틈타 옆에서 뛰쳐나와, 피 묻은 부러진 비녀를 알을 든 병사의 어깨에 꽂는다.</w:t>
       </w:r>
     </w:p>
     <w:p>
@@ -3395,7 +3186,7 @@
           <w:color w:val="1A1A1A"/>
           <w:sz w:val="21"/>
         </w:rPr>
-        <w:t>(2-2) △士兵1一把将伊索尔德推倒在地，不理会她的哭喊，带着龙蛋朝着兵营方向离去。</w:t>
+        <w:t>애원하던 이졸데의 눈빛이 돌변한다. 오른손으로 머리에서 금비녀 하나를 홱 뽑는다.</w:t>
       </w:r>
     </w:p>
     <w:p>
@@ -3409,7 +3200,7 @@
           <w:color w:val="1A1A1A"/>
           <w:sz w:val="21"/>
         </w:rPr>
-        <w:t>번역</w:t>
+        <w:t>문제</w:t>
       </w:r>
       <w:r>
         <w:rPr>
@@ -3418,7 +3209,7 @@
           <w:color w:val="1A1A1A"/>
           <w:sz w:val="21"/>
         </w:rPr>
-        <w:t>:</w:t>
+        <w:t>: 1·3화의 무기는 머리에 숨긴 부러진 비녀 반쪽인데, 8화에는 멀쩡한 금비녀가 머리에서 나와요. 영상에서 다른 물건으로 나오고, 감옥에 갇혀 머리채까지 잡혀 끌려다닌 이졸데가 금비녀를 꽂고 있는 것도 어색해요.</w:t>
       </w:r>
     </w:p>
     <w:p>
@@ -3428,25 +3219,34 @@
       <w:r>
         <w:rPr>
           <w:rFonts w:ascii="맑은 고딕" w:hAnsi="맑은 고딕" w:eastAsia="맑은 고딕"/>
+          <w:b/>
+          <w:color w:val="1A1A1A"/>
+          <w:sz w:val="21"/>
+        </w:rPr>
+        <w:t>제안</w:t>
+      </w:r>
+      <w:r>
+        <w:rPr>
+          <w:rFonts w:ascii="맑은 고딕" w:hAnsi="맑은 고딕" w:eastAsia="맑은 고딕"/>
           <w:b w:val="0"/>
           <w:color w:val="1A1A1A"/>
           <w:sz w:val="21"/>
         </w:rPr>
-        <w:t>1-2 등장인물: 이졸데, 악질 병사, 국경 병사 1, 국경 병사 2</w:t>
+        <w:t>: 8-1의 「金簪」 세 곳을 「碎簪」으로 바꾸고, 이 줄을 「△伊索尔德原本哀求的眼神骤然变得狠戾，右手猛地从散乱的头发里抽出那半截碎簪。」로 하면 1화에 숨긴 비녀가 8화에 다시 나와요.</w:t>
       </w:r>
     </w:p>
     <w:p>
       <w:pPr>
-        <w:spacing w:before="0" w:after="100" w:line="312" w:lineRule="auto"/>
-      </w:pPr>
-      <w:r>
-        <w:rPr>
-          <w:rFonts w:ascii="맑은 고딕" w:hAnsi="맑은 고딕" w:eastAsia="맑은 고딕"/>
-          <w:b w:val="0"/>
-          <w:color w:val="1A1A1A"/>
-          <w:sz w:val="21"/>
-        </w:rPr>
-        <w:t>2-2 등장인물: 이졸데, 마을 주민 여럿, 국경 순찰 병사 1, 순찰 병사 2</w:t>
+        <w:spacing w:before="200" w:after="60" w:line="312" w:lineRule="auto"/>
+      </w:pPr>
+      <w:r>
+        <w:rPr>
+          <w:rFonts w:ascii="맑은 고딕" w:hAnsi="맑은 고딕" w:eastAsia="맑은 고딕"/>
+          <w:b/>
+          <w:color w:val="1A1A1A"/>
+          <w:sz w:val="22"/>
+        </w:rPr>
+        <w:t>[4·5화 · 4-1 / 5-1] 반지 생김새와 끼고 있는 위치가 바뀌어요</w:t>
       </w:r>
     </w:p>
     <w:p>
@@ -3456,11 +3256,20 @@
       <w:r>
         <w:rPr>
           <w:rFonts w:ascii="맑은 고딕" w:hAnsi="맑은 고딕" w:eastAsia="맑은 고딕"/>
+          <w:b/>
+          <w:color w:val="1A1A1A"/>
+          <w:sz w:val="21"/>
+        </w:rPr>
+        <w:t>원문</w:t>
+      </w:r>
+      <w:r>
+        <w:rPr>
+          <w:rFonts w:ascii="맑은 고딕" w:hAnsi="맑은 고딕" w:eastAsia="맑은 고딕"/>
           <w:b w:val="0"/>
           <w:color w:val="1A1A1A"/>
           <w:sz w:val="21"/>
         </w:rPr>
-        <w:t>국경 병사 1(호통치며): 멈춰! 품에 숨긴 게 뭐야? 내놔!</w:t>
+        <w:t>:</w:t>
       </w:r>
     </w:p>
     <w:p>
@@ -3474,7 +3283,7 @@
           <w:color w:val="1A1A1A"/>
           <w:sz w:val="21"/>
         </w:rPr>
-        <w:t>병사 2가 거칠게 손을 뻗어 이졸데 품에서 알 두 개를 억지로 빼앗는다!</w:t>
+        <w:t>(4-1) △伊索尔德从贴身衣襟里摸出一枚黑底金纹，龙形环绕的戒指。她将戒指高高举起。</w:t>
       </w:r>
     </w:p>
     <w:p>
@@ -3488,7 +3297,7 @@
           <w:color w:val="1A1A1A"/>
           <w:sz w:val="21"/>
         </w:rPr>
-        <w:t>병사 1이 이졸데를 밀쳐 넘어뜨리고, 울부짖는 소리를 무시한 채 알을 가지고 병영 쪽으로 떠난다.</w:t>
+        <w:t>(5-1) △伊索尔德将手举到埃德里克面前，无名指上的黑宝石的戒指闪烁着幽光。</w:t>
       </w:r>
     </w:p>
     <w:p>
@@ -3502,7 +3311,7 @@
           <w:color w:val="1A1A1A"/>
           <w:sz w:val="21"/>
         </w:rPr>
-        <w:t>문제</w:t>
+        <w:t>번역</w:t>
       </w:r>
       <w:r>
         <w:rPr>
@@ -3511,7 +3320,7 @@
           <w:color w:val="1A1A1A"/>
           <w:sz w:val="21"/>
         </w:rPr>
-        <w:t>: 2-2 대사 줄의 「边境士兵1/2」는 1-2에서 이졸데가 당하는 걸 구경하다 눈에 진흙을 맞은 병사들과 이름표가 같아요. 같은 사람이면 이졸데를 바로 알아봐야 해요. 다른 사람이면, 이름표가 같아서 영상을 만들 때 1-2 병사와 같은 얼굴로 나올 수 있어요. 2-2 안에서도 인물 줄은 「巡逻士兵」, 대사·지문은 「边境士兵」「士兵」으로 섞여 있어요. 그리고 알을 빼앗은 건 병사 2인데 알을 들고 떠나는 건 병사 1이에요.</w:t>
+        <w:t>:</w:t>
       </w:r>
     </w:p>
     <w:p>
@@ -3521,34 +3330,25 @@
       <w:r>
         <w:rPr>
           <w:rFonts w:ascii="맑은 고딕" w:hAnsi="맑은 고딕" w:eastAsia="맑은 고딕"/>
-          <w:b/>
-          <w:color w:val="1A1A1A"/>
-          <w:sz w:val="21"/>
-        </w:rPr>
-        <w:t>제안</w:t>
-      </w:r>
-      <w:r>
-        <w:rPr>
-          <w:rFonts w:ascii="맑은 고딕" w:hAnsi="맑은 고딕" w:eastAsia="맑은 고딕"/>
           <w:b w:val="0"/>
           <w:color w:val="1A1A1A"/>
           <w:sz w:val="21"/>
         </w:rPr>
-        <w:t>: 다른 병사라면 2-2의 대사·지문을 모두 「巡逻士兵1」「巡逻士兵2」로 맞춰 주세요. 떠나는 줄은 「△巡逻士兵1一把将伊索尔德推倒在地，巡逻士兵2抱着龙蛋，两人朝兵营方向离去。」처럼 알을 든 사람을 맞춰 주세요.</w:t>
+        <w:t>이졸데가 옷섶 안에서 검은 바탕에 금 무늬, 용이 감긴 반지를 꺼내 높이 든다.</w:t>
       </w:r>
     </w:p>
     <w:p>
       <w:pPr>
-        <w:spacing w:before="200" w:after="60" w:line="312" w:lineRule="auto"/>
-      </w:pPr>
-      <w:r>
-        <w:rPr>
-          <w:rFonts w:ascii="맑은 고딕" w:hAnsi="맑은 고딕" w:eastAsia="맑은 고딕"/>
-          <w:b/>
-          <w:color w:val="1A1A1A"/>
-          <w:sz w:val="22"/>
-        </w:rPr>
-        <w:t>[8화 · 8-1] 1·3화의 "부러진 비녀 반쪽"이 8화에서 "금비녀"로 바뀌어요</w:t>
+        <w:spacing w:before="0" w:after="100" w:line="312" w:lineRule="auto"/>
+      </w:pPr>
+      <w:r>
+        <w:rPr>
+          <w:rFonts w:ascii="맑은 고딕" w:hAnsi="맑은 고딕" w:eastAsia="맑은 고딕"/>
+          <w:b w:val="0"/>
+          <w:color w:val="1A1A1A"/>
+          <w:sz w:val="21"/>
+        </w:rPr>
+        <w:t>이졸데가 에드릭 눈앞에 손을 치켜든다. 약지의 검은 보석 반지가 은은하게 빛난다.</w:t>
       </w:r>
     </w:p>
     <w:p>
@@ -3562,7 +3362,7 @@
           <w:color w:val="1A1A1A"/>
           <w:sz w:val="21"/>
         </w:rPr>
-        <w:t>원문</w:t>
+        <w:t>문제</w:t>
       </w:r>
       <w:r>
         <w:rPr>
@@ -3571,7 +3371,7 @@
           <w:color w:val="1A1A1A"/>
           <w:sz w:val="21"/>
         </w:rPr>
-        <w:t>:</w:t>
+        <w:t>: 4-1에선 손에 들고 있는 "검은 바탕에 금 무늬, 용이 감긴 반지"인데, 바로 이어지는 5-1에선 "약지에 낀 검은 보석 반지"예요. 생김새가 달라 영상에서 다른 반지로 나오고, 언제 손가락에 꼈는지도 없어요.</w:t>
       </w:r>
     </w:p>
     <w:p>
@@ -3581,25 +3381,34 @@
       <w:r>
         <w:rPr>
           <w:rFonts w:ascii="맑은 고딕" w:hAnsi="맑은 고딕" w:eastAsia="맑은 고딕"/>
+          <w:b/>
+          <w:color w:val="1A1A1A"/>
+          <w:sz w:val="21"/>
+        </w:rPr>
+        <w:t>제안</w:t>
+      </w:r>
+      <w:r>
+        <w:rPr>
+          <w:rFonts w:ascii="맑은 고딕" w:hAnsi="맑은 고딕" w:eastAsia="맑은 고딕"/>
           <w:b w:val="0"/>
           <w:color w:val="1A1A1A"/>
           <w:sz w:val="21"/>
         </w:rPr>
-        <w:t>(1-2) △挣扎间，伊索尔德摸出藏在发间的半截碎簪，手腕一翻，狠狠扎进按着她的那只手掌。</w:t>
+        <w:t>: 4-1을 「她将戒指戴上无名指，把手高高举起。」로, 5-1을 「无名指上那枚黑底金纹的龙戒闪烁着幽光。」로 맞춰 주세요.</w:t>
       </w:r>
     </w:p>
     <w:p>
       <w:pPr>
-        <w:spacing w:before="0" w:after="100" w:line="312" w:lineRule="auto"/>
-      </w:pPr>
-      <w:r>
-        <w:rPr>
-          <w:rFonts w:ascii="맑은 고딕" w:hAnsi="맑은 고딕" w:eastAsia="맑은 고딕"/>
-          <w:b w:val="0"/>
-          <w:color w:val="1A1A1A"/>
-          <w:sz w:val="21"/>
-        </w:rPr>
-        <w:t>(3-1) △伊索尔德借着火光与浓烟的掩护，猛地从侧面扑出，带血的碎簪狠狠扎进抱蛋士兵的肩膀。</w:t>
+        <w:spacing w:before="200" w:after="60" w:line="312" w:lineRule="auto"/>
+      </w:pPr>
+      <w:r>
+        <w:rPr>
+          <w:rFonts w:ascii="맑은 고딕" w:hAnsi="맑은 고딕" w:eastAsia="맑은 고딕"/>
+          <w:b/>
+          <w:color w:val="1A1A1A"/>
+          <w:sz w:val="22"/>
+        </w:rPr>
+        <w:t>[5~8화 · 5-1 / 5-2] 5-1 「重枷」와 5-2 쇠고랑이 다르고, 쇠고랑이 5-2 뒤로 사라져요</w:t>
       </w:r>
     </w:p>
     <w:p>
@@ -3609,11 +3418,20 @@
       <w:r>
         <w:rPr>
           <w:rFonts w:ascii="맑은 고딕" w:hAnsi="맑은 고딕" w:eastAsia="맑은 고딕"/>
+          <w:b/>
+          <w:color w:val="1A1A1A"/>
+          <w:sz w:val="21"/>
+        </w:rPr>
+        <w:t>원문</w:t>
+      </w:r>
+      <w:r>
+        <w:rPr>
+          <w:rFonts w:ascii="맑은 고딕" w:hAnsi="맑은 고딕" w:eastAsia="맑은 고딕"/>
           <w:b w:val="0"/>
           <w:color w:val="1A1A1A"/>
           <w:sz w:val="21"/>
         </w:rPr>
-        <w:t>(8-1) △伊索尔德原本哀求的眼神骤然变得狠戾，右手猛地从头发上取下一支金簪。</w:t>
+        <w:t>:</w:t>
       </w:r>
     </w:p>
     <w:p>
@@ -3623,20 +3441,11 @@
       <w:r>
         <w:rPr>
           <w:rFonts w:ascii="맑은 고딕" w:hAnsi="맑은 고딕" w:eastAsia="맑은 고딕"/>
-          <w:b/>
-          <w:color w:val="1A1A1A"/>
-          <w:sz w:val="21"/>
-        </w:rPr>
-        <w:t>번역</w:t>
-      </w:r>
-      <w:r>
-        <w:rPr>
-          <w:rFonts w:ascii="맑은 고딕" w:hAnsi="맑은 고딕" w:eastAsia="맑은 고딕"/>
           <w:b w:val="0"/>
           <w:color w:val="1A1A1A"/>
           <w:sz w:val="21"/>
         </w:rPr>
-        <w:t>:</w:t>
+        <w:t>(5-1) 埃德里克（抬头看向卫兵）：给这个撒谎的荡妇套上重枷。让她去洗大殿的地板，直到骨头烂掉！</w:t>
       </w:r>
     </w:p>
     <w:p>
@@ -3650,7 +3459,7 @@
           <w:color w:val="1A1A1A"/>
           <w:sz w:val="21"/>
         </w:rPr>
-        <w:t>몸부림치던 이졸데가 머리카락 사이에 숨긴 부러진 비녀 반쪽을 꺼내, 손목을 틀어 자기를 누르는 손바닥에 꽂는다.</w:t>
+        <w:t>(5-2) △深夜，昏暗的走廊。伊索尔德手上戴着铁镣，趴在地上用抹布擦拭地砖。</w:t>
       </w:r>
     </w:p>
     <w:p>
@@ -3664,7 +3473,7 @@
           <w:color w:val="1A1A1A"/>
           <w:sz w:val="21"/>
         </w:rPr>
-        <w:t>이졸데가 불빛과 연기를 틈타 옆에서 뛰쳐나와, 피 묻은 부러진 비녀를 알을 든 병사의 어깨에 꽂는다.</w:t>
+        <w:t>(5-2) △伊索尔德拖着铁链，猫着身子顺着墙壁一路走到一个铁栅栏前。</w:t>
       </w:r>
     </w:p>
     <w:p>
@@ -3674,11 +3483,20 @@
       <w:r>
         <w:rPr>
           <w:rFonts w:ascii="맑은 고딕" w:hAnsi="맑은 고딕" w:eastAsia="맑은 고딕"/>
+          <w:b/>
+          <w:color w:val="1A1A1A"/>
+          <w:sz w:val="21"/>
+        </w:rPr>
+        <w:t>번역</w:t>
+      </w:r>
+      <w:r>
+        <w:rPr>
+          <w:rFonts w:ascii="맑은 고딕" w:hAnsi="맑은 고딕" w:eastAsia="맑은 고딕"/>
           <w:b w:val="0"/>
           <w:color w:val="1A1A1A"/>
           <w:sz w:val="21"/>
         </w:rPr>
-        <w:t>애원하던 이졸데의 눈빛이 돌변한다. 오른손으로 머리에서 금비녀 하나를 홱 뽑는다.</w:t>
+        <w:t>:</w:t>
       </w:r>
     </w:p>
     <w:p>
@@ -3688,20 +3506,11 @@
       <w:r>
         <w:rPr>
           <w:rFonts w:ascii="맑은 고딕" w:hAnsi="맑은 고딕" w:eastAsia="맑은 고딕"/>
-          <w:b/>
-          <w:color w:val="1A1A1A"/>
-          <w:sz w:val="21"/>
-        </w:rPr>
-        <w:t>문제</w:t>
-      </w:r>
-      <w:r>
-        <w:rPr>
-          <w:rFonts w:ascii="맑은 고딕" w:hAnsi="맑은 고딕" w:eastAsia="맑은 고딕"/>
           <w:b w:val="0"/>
           <w:color w:val="1A1A1A"/>
           <w:sz w:val="21"/>
         </w:rPr>
-        <w:t>: 1·3화의 무기는 머리에 숨긴 부러진 비녀 반쪽인데, 8화에는 멀쩡한 금비녀가 머리에서 나와요. 영상에서 다른 물건으로 나오고, 감옥에 갇혀 머리채까지 잡혀 끌려다닌 이졸데가 금비녀를 꽂고 있는 것도 어색해요.</w:t>
+        <w:t>에드릭(근위병을 올려다보며): 이 거짓말쟁이 창녀한테 무거운 칼을 씌워라. 뼈가 썩을 때까지 대전 바닥을 닦게 해!</w:t>
       </w:r>
     </w:p>
     <w:p>
@@ -3711,34 +3520,25 @@
       <w:r>
         <w:rPr>
           <w:rFonts w:ascii="맑은 고딕" w:hAnsi="맑은 고딕" w:eastAsia="맑은 고딕"/>
-          <w:b/>
-          <w:color w:val="1A1A1A"/>
-          <w:sz w:val="21"/>
-        </w:rPr>
-        <w:t>제안</w:t>
-      </w:r>
-      <w:r>
-        <w:rPr>
-          <w:rFonts w:ascii="맑은 고딕" w:hAnsi="맑은 고딕" w:eastAsia="맑은 고딕"/>
           <w:b w:val="0"/>
           <w:color w:val="1A1A1A"/>
           <w:sz w:val="21"/>
         </w:rPr>
-        <w:t>: 8-1의 「金簪」 세 곳을 「碎簪」으로 바꾸고, 이 줄을 「△伊索尔德原本哀求的眼神骤然变得狠戾，右手猛地从散乱的头发里抽出那半截碎簪。」로 하면 1화에 숨긴 비녀가 8화에 다시 나와요.</w:t>
+        <w:t>깊은 밤, 어두운 복도. 손에 쇠고랑을 찬 이졸데가 바닥에 엎드려 걸레로 바닥을 닦는다.</w:t>
       </w:r>
     </w:p>
     <w:p>
       <w:pPr>
-        <w:spacing w:before="200" w:after="60" w:line="312" w:lineRule="auto"/>
-      </w:pPr>
-      <w:r>
-        <w:rPr>
-          <w:rFonts w:ascii="맑은 고딕" w:hAnsi="맑은 고딕" w:eastAsia="맑은 고딕"/>
-          <w:b/>
-          <w:color w:val="1A1A1A"/>
-          <w:sz w:val="22"/>
-        </w:rPr>
-        <w:t>[4·5화 · 4-1 / 5-1] 반지 생김새와 끼고 있는 위치가 바뀌어요</w:t>
+        <w:spacing w:before="0" w:after="100" w:line="312" w:lineRule="auto"/>
+      </w:pPr>
+      <w:r>
+        <w:rPr>
+          <w:rFonts w:ascii="맑은 고딕" w:hAnsi="맑은 고딕" w:eastAsia="맑은 고딕"/>
+          <w:b w:val="0"/>
+          <w:color w:val="1A1A1A"/>
+          <w:sz w:val="21"/>
+        </w:rPr>
+        <w:t>이졸데가 쇠사슬을 끌며 몸을 낮추고 벽을 따라 철창 앞까지 간다.</w:t>
       </w:r>
     </w:p>
     <w:p>
@@ -3752,7 +3552,7 @@
           <w:color w:val="1A1A1A"/>
           <w:sz w:val="21"/>
         </w:rPr>
-        <w:t>원문</w:t>
+        <w:t>문제</w:t>
       </w:r>
       <w:r>
         <w:rPr>
@@ -3761,7 +3561,7 @@
           <w:color w:val="1A1A1A"/>
           <w:sz w:val="21"/>
         </w:rPr>
-        <w:t>:</w:t>
+        <w:t>: 5-1에서 에드릭은 목에 씌우는 무거운 칼(重枷)을 채우라는데 5-2는 손 쇠고랑이에요. 그리고 쇠고랑은 5-2 뒤로 한 번도 안 나와서, 6~8화에 차고 있는지 풀렸는지 정해야 그릴 수 있어요(7-2 술잔, 8-1 비녀 모두 손으로 해요).</w:t>
       </w:r>
     </w:p>
     <w:p>
@@ -3771,25 +3571,34 @@
       <w:r>
         <w:rPr>
           <w:rFonts w:ascii="맑은 고딕" w:hAnsi="맑은 고딕" w:eastAsia="맑은 고딕"/>
+          <w:b/>
+          <w:color w:val="1A1A1A"/>
+          <w:sz w:val="21"/>
+        </w:rPr>
+        <w:t>제안</w:t>
+      </w:r>
+      <w:r>
+        <w:rPr>
+          <w:rFonts w:ascii="맑은 고딕" w:hAnsi="맑은 고딕" w:eastAsia="맑은 고딕"/>
           <w:b w:val="0"/>
           <w:color w:val="1A1A1A"/>
           <w:sz w:val="21"/>
         </w:rPr>
-        <w:t>(4-1) △伊索尔德从贴身衣襟里摸出一枚黑底金纹，龙形环绕的戒指。她将戒指高高举起。</w:t>
+        <w:t>: 5-1을 「套上铁镣」로 맞춰 주세요. 6~8화에도 차고 있게 하시려면 6-1 「两名卫兵拖着双手沾满鲜血、极度虚弱的伊索尔德走进来」에 「戴着铁镣」를 한 번 넣어 주세요(사슬 찬 손으로 술잔을 휘두르는 그림이 더 세요). 풀리는 거라면 어디서 풀리는지 한 줄 넣어 주세요.</w:t>
       </w:r>
     </w:p>
     <w:p>
       <w:pPr>
-        <w:spacing w:before="0" w:after="100" w:line="312" w:lineRule="auto"/>
-      </w:pPr>
-      <w:r>
-        <w:rPr>
-          <w:rFonts w:ascii="맑은 고딕" w:hAnsi="맑은 고딕" w:eastAsia="맑은 고딕"/>
-          <w:b w:val="0"/>
-          <w:color w:val="1A1A1A"/>
-          <w:sz w:val="21"/>
-        </w:rPr>
-        <w:t>(5-1) △伊索尔德将手举到埃德里克面前，无名指上的黑宝石的戒指闪烁着幽光。</w:t>
+        <w:spacing w:before="200" w:after="60" w:line="312" w:lineRule="auto"/>
+      </w:pPr>
+      <w:r>
+        <w:rPr>
+          <w:rFonts w:ascii="맑은 고딕" w:hAnsi="맑은 고딕" w:eastAsia="맑은 고딕"/>
+          <w:b/>
+          <w:color w:val="1A1A1A"/>
+          <w:sz w:val="22"/>
+        </w:rPr>
+        <w:t>[5화 · 5-2] 손바닥을 그었는데 철창에 대는 건 손목이에요</w:t>
       </w:r>
     </w:p>
     <w:p>
@@ -3803,7 +3612,7 @@
           <w:color w:val="1A1A1A"/>
           <w:sz w:val="21"/>
         </w:rPr>
-        <w:t>번역</w:t>
+        <w:t>원문</w:t>
       </w:r>
       <w:r>
         <w:rPr>
@@ -3826,7 +3635,7 @@
           <w:color w:val="1A1A1A"/>
           <w:sz w:val="21"/>
         </w:rPr>
-        <w:t>이졸데가 옷섶 안에서 검은 바탕에 금 무늬, 용이 감긴 반지를 꺼내 높이 든다.</w:t>
+        <w:t>(5-2) △伊索尔德捡起地上的一个破陶碗，砸碎后捡起一块瓷片，在自己手心划了一下。</w:t>
       </w:r>
     </w:p>
     <w:p>
@@ -3840,7 +3649,7 @@
           <w:color w:val="1A1A1A"/>
           <w:sz w:val="21"/>
         </w:rPr>
-        <w:t>이졸데가 에드릭 눈앞에 손을 치켜든다. 약지의 검은 보석 반지가 은은하게 빛난다.</w:t>
+        <w:t>(5-2) △鲜血瞬间涌出。伊索尔德将流血的手腕死死贴在冰冷的铁栅栏上，让鲜血顺着石缝一滴滴流进宝库。</w:t>
       </w:r>
     </w:p>
     <w:p>
@@ -3850,20 +3659,11 @@
       <w:r>
         <w:rPr>
           <w:rFonts w:ascii="맑은 고딕" w:hAnsi="맑은 고딕" w:eastAsia="맑은 고딕"/>
-          <w:b/>
-          <w:color w:val="1A1A1A"/>
-          <w:sz w:val="21"/>
-        </w:rPr>
-        <w:t>문제</w:t>
-      </w:r>
-      <w:r>
-        <w:rPr>
-          <w:rFonts w:ascii="맑은 고딕" w:hAnsi="맑은 고딕" w:eastAsia="맑은 고딕"/>
           <w:b w:val="0"/>
           <w:color w:val="1A1A1A"/>
           <w:sz w:val="21"/>
         </w:rPr>
-        <w:t>: 4-1에선 손에 들고 있는 "검은 바탕에 금 무늬, 용이 감긴 반지"인데, 바로 이어지는 5-1에선 "약지에 낀 검은 보석 반지"예요. 생김새가 달라 영상에서 다른 반지로 나오고, 언제 손가락에 꼈는지도 없어요.</w:t>
+        <w:t>(5-4) △突然，一只皮靴猛地狠狠地踩在了伊索尔德还在滴血的左手伤口上，并用力往下碾压。</w:t>
       </w:r>
     </w:p>
     <w:p>
@@ -3877,7 +3677,7 @@
           <w:color w:val="1A1A1A"/>
           <w:sz w:val="21"/>
         </w:rPr>
-        <w:t>제안</w:t>
+        <w:t>번역</w:t>
       </w:r>
       <w:r>
         <w:rPr>
@@ -3886,21 +3686,21 @@
           <w:color w:val="1A1A1A"/>
           <w:sz w:val="21"/>
         </w:rPr>
-        <w:t>: 4-1을 「她将戒指戴上无名指，把手高高举起。」로, 5-1을 「无名指上那枚黑底金纹的龙戒闪烁着幽光。」로 맞춰 주세요.</w:t>
+        <w:t>:</w:t>
       </w:r>
     </w:p>
     <w:p>
       <w:pPr>
-        <w:spacing w:before="200" w:after="60" w:line="312" w:lineRule="auto"/>
-      </w:pPr>
-      <w:r>
-        <w:rPr>
-          <w:rFonts w:ascii="맑은 고딕" w:hAnsi="맑은 고딕" w:eastAsia="맑은 고딕"/>
-          <w:b/>
-          <w:color w:val="1A1A1A"/>
-          <w:sz w:val="22"/>
-        </w:rPr>
-        <w:t>[5~8화 · 5-1 / 5-2] 5-1 「重枷」와 5-2 쇠고랑이 다르고, 쇠고랑이 5-2 뒤로 사라져요</w:t>
+        <w:spacing w:before="0" w:after="100" w:line="312" w:lineRule="auto"/>
+      </w:pPr>
+      <w:r>
+        <w:rPr>
+          <w:rFonts w:ascii="맑은 고딕" w:hAnsi="맑은 고딕" w:eastAsia="맑은 고딕"/>
+          <w:b w:val="0"/>
+          <w:color w:val="1A1A1A"/>
+          <w:sz w:val="21"/>
+        </w:rPr>
+        <w:t>이졸데가 바닥의 깨진 사발을 주워 더 깨뜨리고, 파편 하나로 자기 손바닥을 긋는다.</w:t>
       </w:r>
     </w:p>
     <w:p>
@@ -3910,20 +3710,11 @@
       <w:r>
         <w:rPr>
           <w:rFonts w:ascii="맑은 고딕" w:hAnsi="맑은 고딕" w:eastAsia="맑은 고딕"/>
-          <w:b/>
-          <w:color w:val="1A1A1A"/>
-          <w:sz w:val="21"/>
-        </w:rPr>
-        <w:t>원문</w:t>
-      </w:r>
-      <w:r>
-        <w:rPr>
-          <w:rFonts w:ascii="맑은 고딕" w:hAnsi="맑은 고딕" w:eastAsia="맑은 고딕"/>
           <w:b w:val="0"/>
           <w:color w:val="1A1A1A"/>
           <w:sz w:val="21"/>
         </w:rPr>
-        <w:t>:</w:t>
+        <w:t>피가 쏟아진다. 이졸데가 피 흐르는 손목을 차가운 철창에 바짝 대고, 피가 돌 틈을 따라 한 방울씩 보물고 안으로 흘러들게 한다.</w:t>
       </w:r>
     </w:p>
     <w:p>
@@ -3937,7 +3728,7 @@
           <w:color w:val="1A1A1A"/>
           <w:sz w:val="21"/>
         </w:rPr>
-        <w:t>(5-1) 埃德里克（抬头看向卫兵）：给这个撒谎的荡妇套上重枷。让她去洗大殿的地板，直到骨头烂掉！</w:t>
+        <w:t>갑자기 가죽 장화가 아직 피가 흐르는 이졸데의 왼손 상처를 세게 밟고 짓이긴다.</w:t>
       </w:r>
     </w:p>
     <w:p>
@@ -3947,11 +3738,20 @@
       <w:r>
         <w:rPr>
           <w:rFonts w:ascii="맑은 고딕" w:hAnsi="맑은 고딕" w:eastAsia="맑은 고딕"/>
+          <w:b/>
+          <w:color w:val="1A1A1A"/>
+          <w:sz w:val="21"/>
+        </w:rPr>
+        <w:t>문제</w:t>
+      </w:r>
+      <w:r>
+        <w:rPr>
+          <w:rFonts w:ascii="맑은 고딕" w:hAnsi="맑은 고딕" w:eastAsia="맑은 고딕"/>
           <w:b w:val="0"/>
           <w:color w:val="1A1A1A"/>
           <w:sz w:val="21"/>
         </w:rPr>
-        <w:t>(5-2) △深夜，昏暗的走廊。伊索尔德手上戴着铁镣，趴在地上用抹布擦拭地砖。</w:t>
+        <w:t>: 그은 곳은 손바닥인데 철창에 대는 건 손목이라, 영상에서 상처가 두 군데로 나와요. 어느 손인지도 5-4에서야 나와요.</w:t>
       </w:r>
     </w:p>
     <w:p>
@@ -3961,34 +3761,34 @@
       <w:r>
         <w:rPr>
           <w:rFonts w:ascii="맑은 고딕" w:hAnsi="맑은 고딕" w:eastAsia="맑은 고딕"/>
+          <w:b/>
+          <w:color w:val="1A1A1A"/>
+          <w:sz w:val="21"/>
+        </w:rPr>
+        <w:t>제안</w:t>
+      </w:r>
+      <w:r>
+        <w:rPr>
+          <w:rFonts w:ascii="맑은 고딕" w:hAnsi="맑은 고딕" w:eastAsia="맑은 고딕"/>
           <w:b w:val="0"/>
           <w:color w:val="1A1A1A"/>
           <w:sz w:val="21"/>
         </w:rPr>
-        <w:t>(5-2) △伊索尔德拖着铁链，猫着身子顺着墙壁一路走到一个铁栅栏前。</w:t>
+        <w:t>: 「伊索尔德将流血的左手掌心死死贴在冰冷的铁栅栏上」로 맞춰 주세요(5-4 「左手伤口」와도 맞아요).</w:t>
       </w:r>
     </w:p>
     <w:p>
       <w:pPr>
-        <w:spacing w:before="0" w:after="100" w:line="312" w:lineRule="auto"/>
+        <w:spacing w:before="200" w:after="60" w:line="312" w:lineRule="auto"/>
       </w:pPr>
       <w:r>
         <w:rPr>
           <w:rFonts w:ascii="맑은 고딕" w:hAnsi="맑은 고딕" w:eastAsia="맑은 고딕"/>
           <w:b/>
           <w:color w:val="1A1A1A"/>
-          <w:sz w:val="21"/>
-        </w:rPr>
-        <w:t>번역</w:t>
-      </w:r>
-      <w:r>
-        <w:rPr>
-          <w:rFonts w:ascii="맑은 고딕" w:hAnsi="맑은 고딕" w:eastAsia="맑은 고딕"/>
-          <w:b w:val="0"/>
-          <w:color w:val="1A1A1A"/>
-          <w:sz w:val="21"/>
-        </w:rPr>
-        <w:t>:</w:t>
+          <w:sz w:val="22"/>
+        </w:rPr>
+        <w:t>[7화 · 7-2] 에드릭 대사가 지문 줄 안에 붙어 있어요</w:t>
       </w:r>
     </w:p>
     <w:p>
@@ -3998,11 +3798,20 @@
       <w:r>
         <w:rPr>
           <w:rFonts w:ascii="맑은 고딕" w:hAnsi="맑은 고딕" w:eastAsia="맑은 고딕"/>
+          <w:b/>
+          <w:color w:val="1A1A1A"/>
+          <w:sz w:val="21"/>
+        </w:rPr>
+        <w:t>원문</w:t>
+      </w:r>
+      <w:r>
+        <w:rPr>
+          <w:rFonts w:ascii="맑은 고딕" w:hAnsi="맑은 고딕" w:eastAsia="맑은 고딕"/>
           <w:b w:val="0"/>
           <w:color w:val="1A1A1A"/>
           <w:sz w:val="21"/>
         </w:rPr>
-        <w:t>에드릭(근위병을 올려다보며): 이 거짓말쟁이 창녀한테 무거운 칼을 씌워라. 뼈가 썩을 때까지 대전 바닥을 닦게 해!</w:t>
+        <w:t>:</w:t>
       </w:r>
     </w:p>
     <w:p>
@@ -4016,7 +3825,7 @@
           <w:color w:val="1A1A1A"/>
           <w:sz w:val="21"/>
         </w:rPr>
-        <w:t>깊은 밤, 어두운 복도. 손에 쇠고랑을 찬 이졸데가 바닥에 엎드려 걸레로 바닥을 닦는다.</w:t>
+        <w:t>(7-2) △埃德里克扯开自己的领口，沉重的身躯直接压上去，死死将伊索尔德按在身下。埃德里克（声音嘶哑）：王后？你现在只是我的情妇。叫出声来，让我听听龙族听过的声音！</w:t>
       </w:r>
     </w:p>
     <w:p>
@@ -4026,11 +3835,20 @@
       <w:r>
         <w:rPr>
           <w:rFonts w:ascii="맑은 고딕" w:hAnsi="맑은 고딕" w:eastAsia="맑은 고딕"/>
+          <w:b/>
+          <w:color w:val="1A1A1A"/>
+          <w:sz w:val="21"/>
+        </w:rPr>
+        <w:t>번역</w:t>
+      </w:r>
+      <w:r>
+        <w:rPr>
+          <w:rFonts w:ascii="맑은 고딕" w:hAnsi="맑은 고딕" w:eastAsia="맑은 고딕"/>
           <w:b w:val="0"/>
           <w:color w:val="1A1A1A"/>
           <w:sz w:val="21"/>
         </w:rPr>
-        <w:t>이졸데가 쇠사슬을 끌며 몸을 낮추고 벽을 따라 철창 앞까지 간다.</w:t>
+        <w:t>:</w:t>
       </w:r>
     </w:p>
     <w:p>
@@ -4040,20 +3858,11 @@
       <w:r>
         <w:rPr>
           <w:rFonts w:ascii="맑은 고딕" w:hAnsi="맑은 고딕" w:eastAsia="맑은 고딕"/>
-          <w:b/>
-          <w:color w:val="1A1A1A"/>
-          <w:sz w:val="21"/>
-        </w:rPr>
-        <w:t>문제</w:t>
-      </w:r>
-      <w:r>
-        <w:rPr>
-          <w:rFonts w:ascii="맑은 고딕" w:hAnsi="맑은 고딕" w:eastAsia="맑은 고딕"/>
           <w:b w:val="0"/>
           <w:color w:val="1A1A1A"/>
           <w:sz w:val="21"/>
         </w:rPr>
-        <w:t>: 5-1에서 에드릭은 목에 씌우는 무거운 칼(重枷)을 채우라는데 5-2는 손 쇠고랑이에요. 그리고 쇠고랑은 5-2 뒤로 한 번도 안 나와서, 6~8화에 차고 있는지 풀렸는지 정해야 그릴 수 있어요(7-2 술잔, 8-1 비녀 모두 손으로 해요).</w:t>
+        <w:t>에드릭이 옷깃을 풀어헤치고 육중한 몸으로 덮쳐 이졸데를 짓누른다. 에드릭(쉰 목소리로): 왕후? 이젠 내 정부일 뿐이야. 소리 내 봐. 용족이 들었던 소리를 나도 들어 보자!</w:t>
       </w:r>
     </w:p>
     <w:p>
@@ -4067,7 +3876,7 @@
           <w:color w:val="1A1A1A"/>
           <w:sz w:val="21"/>
         </w:rPr>
-        <w:t>제안</w:t>
+        <w:t>문제</w:t>
       </w:r>
       <w:r>
         <w:rPr>
@@ -4076,44 +3885,44 @@
           <w:color w:val="1A1A1A"/>
           <w:sz w:val="21"/>
         </w:rPr>
-        <w:t>: 5-1을 「套上铁镣」로 맞춰 주세요. 6~8화에도 차고 있게 하시려면 6-1 「两名卫兵拖着双手沾满鲜血、极度虚弱的伊索尔德走进来」에 「戴着铁镣」를 한 번 넣어 주세요(사슬 찬 손으로 술잔을 휘두르는 그림이 더 세요). 풀리는 거라면 어디서 풀리는지 한 줄 넣어 주세요.</w:t>
+        <w:t>: 대사가 지문 줄 안에 있어서 대사로 안 읽히고 빠질 수 있어요.</w:t>
       </w:r>
     </w:p>
     <w:p>
       <w:pPr>
-        <w:spacing w:before="200" w:after="60" w:line="312" w:lineRule="auto"/>
+        <w:spacing w:before="0" w:after="100" w:line="312" w:lineRule="auto"/>
       </w:pPr>
       <w:r>
         <w:rPr>
           <w:rFonts w:ascii="맑은 고딕" w:hAnsi="맑은 고딕" w:eastAsia="맑은 고딕"/>
           <w:b/>
           <w:color w:val="1A1A1A"/>
-          <w:sz w:val="22"/>
-        </w:rPr>
-        <w:t>[5화 · 5-2] 손바닥을 그었는데 철창에 대는 건 손목이에요</w:t>
+          <w:sz w:val="21"/>
+        </w:rPr>
+        <w:t>제안</w:t>
+      </w:r>
+      <w:r>
+        <w:rPr>
+          <w:rFonts w:ascii="맑은 고딕" w:hAnsi="맑은 고딕" w:eastAsia="맑은 고딕"/>
+          <w:b w:val="0"/>
+          <w:color w:val="1A1A1A"/>
+          <w:sz w:val="21"/>
+        </w:rPr>
+        <w:t>: 「埃德里克（声音嘶哑）：」부터 다음 줄로 내려 주세요.</w:t>
       </w:r>
     </w:p>
     <w:p>
       <w:pPr>
-        <w:spacing w:before="0" w:after="100" w:line="312" w:lineRule="auto"/>
+        <w:spacing w:before="200" w:after="60" w:line="312" w:lineRule="auto"/>
       </w:pPr>
       <w:r>
         <w:rPr>
           <w:rFonts w:ascii="맑은 고딕" w:hAnsi="맑은 고딕" w:eastAsia="맑은 고딕"/>
           <w:b/>
           <w:color w:val="1A1A1A"/>
-          <w:sz w:val="21"/>
-        </w:rPr>
-        <w:t>원문</w:t>
-      </w:r>
-      <w:r>
-        <w:rPr>
-          <w:rFonts w:ascii="맑은 고딕" w:hAnsi="맑은 고딕" w:eastAsia="맑은 고딕"/>
-          <w:b w:val="0"/>
-          <w:color w:val="1A1A1A"/>
-          <w:sz w:val="21"/>
-        </w:rPr>
-        <w:t>:</w:t>
+          <w:sz w:val="22"/>
+        </w:rPr>
+        <w:t>[2·7화] 장면에 나오는데 인물 줄에 없는 사람이 두 군데예요</w:t>
       </w:r>
     </w:p>
     <w:p>
@@ -4123,11 +3932,20 @@
       <w:r>
         <w:rPr>
           <w:rFonts w:ascii="맑은 고딕" w:hAnsi="맑은 고딕" w:eastAsia="맑은 고딕"/>
+          <w:b/>
+          <w:color w:val="1A1A1A"/>
+          <w:sz w:val="21"/>
+        </w:rPr>
+        <w:t>원문</w:t>
+      </w:r>
+      <w:r>
+        <w:rPr>
+          <w:rFonts w:ascii="맑은 고딕" w:hAnsi="맑은 고딕" w:eastAsia="맑은 고딕"/>
           <w:b w:val="0"/>
           <w:color w:val="1A1A1A"/>
           <w:sz w:val="21"/>
         </w:rPr>
-        <w:t>(5-2) △伊索尔德捡起地上的一个破陶碗，砸碎后捡起一块瓷片，在自己手心划了一下。</w:t>
+        <w:t>:</w:t>
       </w:r>
     </w:p>
     <w:p>
@@ -4141,7 +3959,7 @@
           <w:color w:val="1A1A1A"/>
           <w:sz w:val="21"/>
         </w:rPr>
-        <w:t>(5-2) △鲜血瞬间涌出。伊索尔德将流血的手腕死死贴在冰冷的铁栅栏上，让鲜血顺着石缝一滴滴流进宝库。</w:t>
+        <w:t>(2-3) △老长老托伦浑身是血跑上前。</w:t>
       </w:r>
     </w:p>
     <w:p>
@@ -4155,7 +3973,7 @@
           <w:color w:val="1A1A1A"/>
           <w:sz w:val="21"/>
         </w:rPr>
-        <w:t>(5-4) △突然，一只皮靴猛地狠狠地踩在了伊索尔德还在滴血的左手伤口上，并用力往下碾压。</w:t>
+        <w:t>(7-3 인물 줄) 出场人物：维尔</w:t>
       </w:r>
     </w:p>
     <w:p>
@@ -4165,20 +3983,11 @@
       <w:r>
         <w:rPr>
           <w:rFonts w:ascii="맑은 고딕" w:hAnsi="맑은 고딕" w:eastAsia="맑은 고딕"/>
-          <w:b/>
-          <w:color w:val="1A1A1A"/>
-          <w:sz w:val="21"/>
-        </w:rPr>
-        <w:t>번역</w:t>
-      </w:r>
-      <w:r>
-        <w:rPr>
-          <w:rFonts w:ascii="맑은 고딕" w:hAnsi="맑은 고딕" w:eastAsia="맑은 고딕"/>
           <w:b w:val="0"/>
           <w:color w:val="1A1A1A"/>
           <w:sz w:val="21"/>
         </w:rPr>
-        <w:t>:</w:t>
+        <w:t>(7-3) △维尔没有理会眼前的敌军，直起身子挥动覆满黑色龙鳞的右臂，一拳狠狠砸向面前的浓烟滚滚的天空。</w:t>
       </w:r>
     </w:p>
     <w:p>
@@ -4188,11 +3997,20 @@
       <w:r>
         <w:rPr>
           <w:rFonts w:ascii="맑은 고딕" w:hAnsi="맑은 고딕" w:eastAsia="맑은 고딕"/>
+          <w:b/>
+          <w:color w:val="1A1A1A"/>
+          <w:sz w:val="21"/>
+        </w:rPr>
+        <w:t>번역</w:t>
+      </w:r>
+      <w:r>
+        <w:rPr>
+          <w:rFonts w:ascii="맑은 고딕" w:hAnsi="맑은 고딕" w:eastAsia="맑은 고딕"/>
           <w:b w:val="0"/>
           <w:color w:val="1A1A1A"/>
           <w:sz w:val="21"/>
         </w:rPr>
-        <w:t>이졸데가 바닥의 깨진 사발을 주워 더 깨뜨리고, 파편 하나로 자기 손바닥을 긋는다.</w:t>
+        <w:t>:</w:t>
       </w:r>
     </w:p>
     <w:p>
@@ -4206,7 +4024,7 @@
           <w:color w:val="1A1A1A"/>
           <w:sz w:val="21"/>
         </w:rPr>
-        <w:t>피가 쏟아진다. 이졸데가 피 흐르는 손목을 차가운 철창에 바짝 대고, 피가 돌 틈을 따라 한 방울씩 보물고 안으로 흘러들게 한다.</w:t>
+        <w:t>피투성이가 된 노장로 토렌이 달려온다.</w:t>
       </w:r>
     </w:p>
     <w:p>
@@ -4220,7 +4038,7 @@
           <w:color w:val="1A1A1A"/>
           <w:sz w:val="21"/>
         </w:rPr>
-        <w:t>갑자기 가죽 장화가 아직 피가 흐르는 이졸데의 왼손 상처를 세게 밟고 짓이긴다.</w:t>
+        <w:t>7-3 등장인물: 바엘</w:t>
       </w:r>
     </w:p>
     <w:p>
@@ -4230,20 +4048,11 @@
       <w:r>
         <w:rPr>
           <w:rFonts w:ascii="맑은 고딕" w:hAnsi="맑은 고딕" w:eastAsia="맑은 고딕"/>
-          <w:b/>
-          <w:color w:val="1A1A1A"/>
-          <w:sz w:val="21"/>
-        </w:rPr>
-        <w:t>문제</w:t>
-      </w:r>
-      <w:r>
-        <w:rPr>
-          <w:rFonts w:ascii="맑은 고딕" w:hAnsi="맑은 고딕" w:eastAsia="맑은 고딕"/>
           <w:b w:val="0"/>
           <w:color w:val="1A1A1A"/>
           <w:sz w:val="21"/>
         </w:rPr>
-        <w:t>: 그은 곳은 손바닥인데 철창에 대는 건 손목이라, 영상에서 상처가 두 군데로 나와요. 어느 손인지도 5-4에서야 나와요.</w:t>
+        <w:t>바엘이 눈앞의 적군은 아랑곳하지 않고 일어나, 검은 용 비늘로 덮인 오른팔로 연기 자욱한 하늘을 향해 주먹을 내지른다.</w:t>
       </w:r>
     </w:p>
     <w:p>
@@ -4257,7 +4066,7 @@
           <w:color w:val="1A1A1A"/>
           <w:sz w:val="21"/>
         </w:rPr>
-        <w:t>제안</w:t>
+        <w:t>문제</w:t>
       </w:r>
       <w:r>
         <w:rPr>
@@ -4266,35 +4075,21 @@
           <w:color w:val="1A1A1A"/>
           <w:sz w:val="21"/>
         </w:rPr>
-        <w:t>: 「伊索尔德将流血的左手掌心死死贴在冰冷的铁栅栏上」로 맞춰 주세요(5-4 「左手伤口」와도 맞아요).</w:t>
+        <w:t>: 2-3 토렌은 대사가 있는데 인물 줄(「维尔、龙族战士、叛军残部」)에 없어요. 7-3 「敌军」은 지문에 나오는데 인물 줄(「维尔」)에 없고, 그 장면에 적군이 보인 적도 없어요.</w:t>
       </w:r>
     </w:p>
     <w:p>
       <w:pPr>
-        <w:spacing w:before="200" w:after="60" w:line="312" w:lineRule="auto"/>
+        <w:spacing w:before="0" w:after="100" w:line="312" w:lineRule="auto"/>
       </w:pPr>
       <w:r>
         <w:rPr>
           <w:rFonts w:ascii="맑은 고딕" w:hAnsi="맑은 고딕" w:eastAsia="맑은 고딕"/>
           <w:b/>
           <w:color w:val="1A1A1A"/>
-          <w:sz w:val="22"/>
-        </w:rPr>
-        <w:t>[7화 · 7-2] 에드릭 대사가 지문 줄 안에 붙어 있어요</w:t>
-      </w:r>
-    </w:p>
-    <w:p>
-      <w:pPr>
-        <w:spacing w:before="0" w:after="100" w:line="312" w:lineRule="auto"/>
-      </w:pPr>
-      <w:r>
-        <w:rPr>
-          <w:rFonts w:ascii="맑은 고딕" w:hAnsi="맑은 고딕" w:eastAsia="맑은 고딕"/>
-          <w:b/>
-          <w:color w:val="1A1A1A"/>
-          <w:sz w:val="21"/>
-        </w:rPr>
-        <w:t>원문</w:t>
+          <w:sz w:val="21"/>
+        </w:rPr>
+        <w:t>제안</w:t>
       </w:r>
       <w:r>
         <w:rPr>
@@ -4303,378 +4098,7 @@
           <w:color w:val="1A1A1A"/>
           <w:sz w:val="21"/>
         </w:rPr>
-        <w:t>:</w:t>
-      </w:r>
-    </w:p>
-    <w:p>
-      <w:pPr>
-        <w:spacing w:before="0" w:after="100" w:line="312" w:lineRule="auto"/>
-      </w:pPr>
-      <w:r>
-        <w:rPr>
-          <w:rFonts w:ascii="맑은 고딕" w:hAnsi="맑은 고딕" w:eastAsia="맑은 고딕"/>
-          <w:b w:val="0"/>
-          <w:color w:val="1A1A1A"/>
-          <w:sz w:val="21"/>
-        </w:rPr>
-        <w:t>(7-2) △埃德里克扯开自己的领口，沉重的身躯直接压上去，死死将伊索尔德按在身下。埃德里克（声音嘶哑）：王后？你现在只是我的情妇。叫出声来，让我听听龙族听过的声音！</w:t>
-      </w:r>
-    </w:p>
-    <w:p>
-      <w:pPr>
-        <w:spacing w:before="0" w:after="100" w:line="312" w:lineRule="auto"/>
-      </w:pPr>
-      <w:r>
-        <w:rPr>
-          <w:rFonts w:ascii="맑은 고딕" w:hAnsi="맑은 고딕" w:eastAsia="맑은 고딕"/>
-          <w:b/>
-          <w:color w:val="1A1A1A"/>
-          <w:sz w:val="21"/>
-        </w:rPr>
-        <w:t>번역</w:t>
-      </w:r>
-      <w:r>
-        <w:rPr>
-          <w:rFonts w:ascii="맑은 고딕" w:hAnsi="맑은 고딕" w:eastAsia="맑은 고딕"/>
-          <w:b w:val="0"/>
-          <w:color w:val="1A1A1A"/>
-          <w:sz w:val="21"/>
-        </w:rPr>
-        <w:t>:</w:t>
-      </w:r>
-    </w:p>
-    <w:p>
-      <w:pPr>
-        <w:spacing w:before="0" w:after="100" w:line="312" w:lineRule="auto"/>
-      </w:pPr>
-      <w:r>
-        <w:rPr>
-          <w:rFonts w:ascii="맑은 고딕" w:hAnsi="맑은 고딕" w:eastAsia="맑은 고딕"/>
-          <w:b w:val="0"/>
-          <w:color w:val="1A1A1A"/>
-          <w:sz w:val="21"/>
-        </w:rPr>
-        <w:t>에드릭이 옷깃을 풀어헤치고 육중한 몸으로 덮쳐 이졸데를 짓누른다. 에드릭(쉰 목소리로): 왕후? 이젠 내 정부일 뿐이야. 소리 내 봐. 용족이 들었던 소리를 나도 들어 보자!</w:t>
-      </w:r>
-    </w:p>
-    <w:p>
-      <w:pPr>
-        <w:spacing w:before="0" w:after="100" w:line="312" w:lineRule="auto"/>
-      </w:pPr>
-      <w:r>
-        <w:rPr>
-          <w:rFonts w:ascii="맑은 고딕" w:hAnsi="맑은 고딕" w:eastAsia="맑은 고딕"/>
-          <w:b/>
-          <w:color w:val="1A1A1A"/>
-          <w:sz w:val="21"/>
-        </w:rPr>
-        <w:t>문제</w:t>
-      </w:r>
-      <w:r>
-        <w:rPr>
-          <w:rFonts w:ascii="맑은 고딕" w:hAnsi="맑은 고딕" w:eastAsia="맑은 고딕"/>
-          <w:b w:val="0"/>
-          <w:color w:val="1A1A1A"/>
-          <w:sz w:val="21"/>
-        </w:rPr>
-        <w:t>: 대사가 지문 줄 안에 있어서 대사로 안 읽히고 빠질 수 있어요.</w:t>
-      </w:r>
-    </w:p>
-    <w:p>
-      <w:pPr>
-        <w:spacing w:before="0" w:after="100" w:line="312" w:lineRule="auto"/>
-      </w:pPr>
-      <w:r>
-        <w:rPr>
-          <w:rFonts w:ascii="맑은 고딕" w:hAnsi="맑은 고딕" w:eastAsia="맑은 고딕"/>
-          <w:b/>
-          <w:color w:val="1A1A1A"/>
-          <w:sz w:val="21"/>
-        </w:rPr>
-        <w:t>제안</w:t>
-      </w:r>
-      <w:r>
-        <w:rPr>
-          <w:rFonts w:ascii="맑은 고딕" w:hAnsi="맑은 고딕" w:eastAsia="맑은 고딕"/>
-          <w:b w:val="0"/>
-          <w:color w:val="1A1A1A"/>
-          <w:sz w:val="21"/>
-        </w:rPr>
-        <w:t>: 「埃德里克（声音嘶哑）：」부터 다음 줄로 내려 주세요.</w:t>
-      </w:r>
-    </w:p>
-    <w:p>
-      <w:pPr>
-        <w:spacing w:before="200" w:after="60" w:line="312" w:lineRule="auto"/>
-      </w:pPr>
-      <w:r>
-        <w:rPr>
-          <w:rFonts w:ascii="맑은 고딕" w:hAnsi="맑은 고딕" w:eastAsia="맑은 고딕"/>
-          <w:b/>
-          <w:color w:val="1A1A1A"/>
-          <w:sz w:val="22"/>
-        </w:rPr>
-        <w:t>[1·2·5·7화] 인물 줄과 지문이 안 맞는 곳이 다섯 군데예요</w:t>
-      </w:r>
-    </w:p>
-    <w:p>
-      <w:pPr>
-        <w:spacing w:before="0" w:after="100" w:line="312" w:lineRule="auto"/>
-      </w:pPr>
-      <w:r>
-        <w:rPr>
-          <w:rFonts w:ascii="맑은 고딕" w:hAnsi="맑은 고딕" w:eastAsia="맑은 고딕"/>
-          <w:b/>
-          <w:color w:val="1A1A1A"/>
-          <w:sz w:val="21"/>
-        </w:rPr>
-        <w:t>원문</w:t>
-      </w:r>
-      <w:r>
-        <w:rPr>
-          <w:rFonts w:ascii="맑은 고딕" w:hAnsi="맑은 고딕" w:eastAsia="맑은 고딕"/>
-          <w:b w:val="0"/>
-          <w:color w:val="1A1A1A"/>
-          <w:sz w:val="21"/>
-        </w:rPr>
-        <w:t>:</w:t>
-      </w:r>
-    </w:p>
-    <w:p>
-      <w:pPr>
-        <w:spacing w:before="0" w:after="100" w:line="312" w:lineRule="auto"/>
-      </w:pPr>
-      <w:r>
-        <w:rPr>
-          <w:rFonts w:ascii="맑은 고딕" w:hAnsi="맑은 고딕" w:eastAsia="맑은 고딕"/>
-          <w:b w:val="0"/>
-          <w:color w:val="1A1A1A"/>
-          <w:sz w:val="21"/>
-        </w:rPr>
-        <w:t>(1-1 인물 줄) 出场人物：维尔、伊索尔德、龙族长老、众龙族</w:t>
-      </w:r>
-    </w:p>
-    <w:p>
-      <w:pPr>
-        <w:spacing w:before="0" w:after="100" w:line="312" w:lineRule="auto"/>
-      </w:pPr>
-      <w:r>
-        <w:rPr>
-          <w:rFonts w:ascii="맑은 고딕" w:hAnsi="맑은 고딕" w:eastAsia="맑은 고딕"/>
-          <w:b w:val="0"/>
-          <w:color w:val="1A1A1A"/>
-          <w:sz w:val="21"/>
-        </w:rPr>
-        <w:t>(1-3) 搜查士兵（VO）：异宝的气息在这！锁死马厩，一只鸟都不许飞出去！</w:t>
-      </w:r>
-    </w:p>
-    <w:p>
-      <w:pPr>
-        <w:spacing w:before="0" w:after="100" w:line="312" w:lineRule="auto"/>
-      </w:pPr>
-      <w:r>
-        <w:rPr>
-          <w:rFonts w:ascii="맑은 고딕" w:hAnsi="맑은 고딕" w:eastAsia="맑은 고딕"/>
-          <w:b w:val="0"/>
-          <w:color w:val="1A1A1A"/>
-          <w:sz w:val="21"/>
-        </w:rPr>
-        <w:t>(2-3) △老长老托伦浑身是血跑上前。</w:t>
-      </w:r>
-    </w:p>
-    <w:p>
-      <w:pPr>
-        <w:spacing w:before="0" w:after="100" w:line="312" w:lineRule="auto"/>
-      </w:pPr>
-      <w:r>
-        <w:rPr>
-          <w:rFonts w:ascii="맑은 고딕" w:hAnsi="맑은 고딕" w:eastAsia="맑은 고딕"/>
-          <w:b w:val="0"/>
-          <w:color w:val="1A1A1A"/>
-          <w:sz w:val="21"/>
-        </w:rPr>
-        <w:t>(5-3 인물 줄) 出场人物：维尔、士兵</w:t>
-      </w:r>
-    </w:p>
-    <w:p>
-      <w:pPr>
-        <w:spacing w:before="0" w:after="100" w:line="312" w:lineRule="auto"/>
-      </w:pPr>
-      <w:r>
-        <w:rPr>
-          <w:rFonts w:ascii="맑은 고딕" w:hAnsi="맑은 고딕" w:eastAsia="맑은 고딕"/>
-          <w:b w:val="0"/>
-          <w:color w:val="1A1A1A"/>
-          <w:sz w:val="21"/>
-        </w:rPr>
-        <w:t>(7-3 인물 줄) 出场人物：维尔</w:t>
-      </w:r>
-    </w:p>
-    <w:p>
-      <w:pPr>
-        <w:spacing w:before="0" w:after="100" w:line="312" w:lineRule="auto"/>
-      </w:pPr>
-      <w:r>
-        <w:rPr>
-          <w:rFonts w:ascii="맑은 고딕" w:hAnsi="맑은 고딕" w:eastAsia="맑은 고딕"/>
-          <w:b w:val="0"/>
-          <w:color w:val="1A1A1A"/>
-          <w:sz w:val="21"/>
-        </w:rPr>
-        <w:t>(7-3) △维尔没有理会眼前的敌军，直起身子挥动覆满黑色龙鳞的右臂，一拳狠狠砸向面前的浓烟滚滚的天空。</w:t>
-      </w:r>
-    </w:p>
-    <w:p>
-      <w:pPr>
-        <w:spacing w:before="0" w:after="100" w:line="312" w:lineRule="auto"/>
-      </w:pPr>
-      <w:r>
-        <w:rPr>
-          <w:rFonts w:ascii="맑은 고딕" w:hAnsi="맑은 고딕" w:eastAsia="맑은 고딕"/>
-          <w:b/>
-          <w:color w:val="1A1A1A"/>
-          <w:sz w:val="21"/>
-        </w:rPr>
-        <w:t>번역</w:t>
-      </w:r>
-      <w:r>
-        <w:rPr>
-          <w:rFonts w:ascii="맑은 고딕" w:hAnsi="맑은 고딕" w:eastAsia="맑은 고딕"/>
-          <w:b w:val="0"/>
-          <w:color w:val="1A1A1A"/>
-          <w:sz w:val="21"/>
-        </w:rPr>
-        <w:t>:</w:t>
-      </w:r>
-    </w:p>
-    <w:p>
-      <w:pPr>
-        <w:spacing w:before="0" w:after="100" w:line="312" w:lineRule="auto"/>
-      </w:pPr>
-      <w:r>
-        <w:rPr>
-          <w:rFonts w:ascii="맑은 고딕" w:hAnsi="맑은 고딕" w:eastAsia="맑은 고딕"/>
-          <w:b w:val="0"/>
-          <w:color w:val="1A1A1A"/>
-          <w:sz w:val="21"/>
-        </w:rPr>
-        <w:t>1-1 등장인물: 바엘, 이졸데, 용족 장로, 용족들</w:t>
-      </w:r>
-    </w:p>
-    <w:p>
-      <w:pPr>
-        <w:spacing w:before="0" w:after="100" w:line="312" w:lineRule="auto"/>
-      </w:pPr>
-      <w:r>
-        <w:rPr>
-          <w:rFonts w:ascii="맑은 고딕" w:hAnsi="맑은 고딕" w:eastAsia="맑은 고딕"/>
-          <w:b w:val="0"/>
-          <w:color w:val="1A1A1A"/>
-          <w:sz w:val="21"/>
-        </w:rPr>
-        <w:t>수색 병사(VO): 보물 기운이 여기서 난다! 마구간을 봉쇄해! 새 한 마리도 못 빠져나가게 해!</w:t>
-      </w:r>
-    </w:p>
-    <w:p>
-      <w:pPr>
-        <w:spacing w:before="0" w:after="100" w:line="312" w:lineRule="auto"/>
-      </w:pPr>
-      <w:r>
-        <w:rPr>
-          <w:rFonts w:ascii="맑은 고딕" w:hAnsi="맑은 고딕" w:eastAsia="맑은 고딕"/>
-          <w:b w:val="0"/>
-          <w:color w:val="1A1A1A"/>
-          <w:sz w:val="21"/>
-        </w:rPr>
-        <w:t>피투성이가 된 노장로 토렌이 달려온다.</w:t>
-      </w:r>
-    </w:p>
-    <w:p>
-      <w:pPr>
-        <w:spacing w:before="0" w:after="100" w:line="312" w:lineRule="auto"/>
-      </w:pPr>
-      <w:r>
-        <w:rPr>
-          <w:rFonts w:ascii="맑은 고딕" w:hAnsi="맑은 고딕" w:eastAsia="맑은 고딕"/>
-          <w:b w:val="0"/>
-          <w:color w:val="1A1A1A"/>
-          <w:sz w:val="21"/>
-        </w:rPr>
-        <w:t>5-3 등장인물: 바엘, 병사</w:t>
-      </w:r>
-    </w:p>
-    <w:p>
-      <w:pPr>
-        <w:spacing w:before="0" w:after="100" w:line="312" w:lineRule="auto"/>
-      </w:pPr>
-      <w:r>
-        <w:rPr>
-          <w:rFonts w:ascii="맑은 고딕" w:hAnsi="맑은 고딕" w:eastAsia="맑은 고딕"/>
-          <w:b w:val="0"/>
-          <w:color w:val="1A1A1A"/>
-          <w:sz w:val="21"/>
-        </w:rPr>
-        <w:t>7-3 등장인물: 바엘</w:t>
-      </w:r>
-    </w:p>
-    <w:p>
-      <w:pPr>
-        <w:spacing w:before="0" w:after="100" w:line="312" w:lineRule="auto"/>
-      </w:pPr>
-      <w:r>
-        <w:rPr>
-          <w:rFonts w:ascii="맑은 고딕" w:hAnsi="맑은 고딕" w:eastAsia="맑은 고딕"/>
-          <w:b w:val="0"/>
-          <w:color w:val="1A1A1A"/>
-          <w:sz w:val="21"/>
-        </w:rPr>
-        <w:t>바엘이 눈앞의 적군은 아랑곳하지 않고 일어나, 검은 용 비늘로 덮인 오른팔로 연기 자욱한 하늘을 향해 주먹을 내지른다.</w:t>
-      </w:r>
-    </w:p>
-    <w:p>
-      <w:pPr>
-        <w:spacing w:before="0" w:after="100" w:line="312" w:lineRule="auto"/>
-      </w:pPr>
-      <w:r>
-        <w:rPr>
-          <w:rFonts w:ascii="맑은 고딕" w:hAnsi="맑은 고딕" w:eastAsia="맑은 고딕"/>
-          <w:b/>
-          <w:color w:val="1A1A1A"/>
-          <w:sz w:val="21"/>
-        </w:rPr>
-        <w:t>문제</w:t>
-      </w:r>
-      <w:r>
-        <w:rPr>
-          <w:rFonts w:ascii="맑은 고딕" w:hAnsi="맑은 고딕" w:eastAsia="맑은 고딕"/>
-          <w:b w:val="0"/>
-          <w:color w:val="1A1A1A"/>
-          <w:sz w:val="21"/>
-        </w:rPr>
-        <w:t>: 1-1 「龙族长老」는 인물 줄에만 있고 장면엔 안 나와요. 1-3 수색 병사와 2-3 토렌은 장면에 나오는데 인물 줄(1-3 「伊索尔德」만, 2-3 「维尔、龙族战士、叛军残部」)에 없어요. 5-3 「士兵」은 인물 줄엔 있는데 지문에 한 번도 안 보여서 바엘이 「把路劈开」를 누구에게 하는지 안 보여요. 7-3 「敌军」은 지문에 한 번 나오는데 인물 줄에도 없고 그 장면에 적군이 보인 적도 없어요.</w:t>
-      </w:r>
-    </w:p>
-    <w:p>
-      <w:pPr>
-        <w:spacing w:before="0" w:after="100" w:line="312" w:lineRule="auto"/>
-      </w:pPr>
-      <w:r>
-        <w:rPr>
-          <w:rFonts w:ascii="맑은 고딕" w:hAnsi="맑은 고딕" w:eastAsia="맑은 고딕"/>
-          <w:b/>
-          <w:color w:val="1A1A1A"/>
-          <w:sz w:val="21"/>
-        </w:rPr>
-        <w:t>제안</w:t>
-      </w:r>
-      <w:r>
-        <w:rPr>
-          <w:rFonts w:ascii="맑은 고딕" w:hAnsi="맑은 고딕" w:eastAsia="맑은 고딕"/>
-          <w:b w:val="0"/>
-          <w:color w:val="1A1A1A"/>
-          <w:sz w:val="21"/>
-        </w:rPr>
-        <w:t>: 인물 줄을 장면에 나오는 사람에 맞춰 주세요. 7-3은 첫 지문에 바엘 앞을 막은 적군을 넣거나, 「没有理会眼前的敌军，」를 빼 주세요.</w:t>
+        <w:t>: 2-3 인물 줄에 「托伦」을 넣어 주세요. 7-3은 첫 지문에 바엘 앞을 막은 적군을 넣고 인물 줄에 「敌军」을 넣거나, 「没有理会眼前的敌军，」를 빼 주세요.</w:t>
       </w:r>
     </w:p>
     <w:p>

</xml_diff>